<commit_message>
Update Gear and Template
</commit_message>
<xml_diff>
--- a/Templates/GoA_Gear_Section_Template.docx
+++ b/Templates/GoA_Gear_Section_Template.docx
@@ -31,7 +31,7 @@
           <w:sz w:val="24"/>
           <w:szCs w:val="24"/>
         </w:rPr>
-        <w:t xml:space="preserve">Implementation guide for adding new gear sections to the Gear tab</w:t>
+        <w:t xml:space="preserve">v2 — includes Rarity column and clear-on-deselect</w:t>
       </w:r>
     </w:p>
     <w:p>
@@ -1068,7 +1068,7 @@
                 <w:sz w:val="18"/>
                 <w:szCs w:val="18"/>
               </w:rPr>
-              <w:t xml:space="preserve">.SECTION-name, .SECTION-effect</w:t>
+              <w:t xml:space="preserve">.SECTION-name, .SECTION-rarity etc.</w:t>
             </w:r>
           </w:p>
         </w:tc>
@@ -1438,7 +1438,7 @@
           <w:sz w:val="22"/>
           <w:szCs w:val="22"/>
         </w:rPr>
-        <w:t xml:space="preserve">Before writing any code, decide what columns your section needs. The clothing section uses three: Name (select), Equipped (checkbox), Effect (tooltip text). Other sections may need different columns.</w:t>
+        <w:t xml:space="preserve">Before writing any code, decide what columns your section needs. The standard layout is: Name (select), Rarity (24px), Equipped (24px), Effect (tooltip text). Other sections may add or remove columns as needed.</w:t>
       </w:r>
     </w:p>
     <w:p>
@@ -1462,7 +1462,7 @@
           <w:sz w:val="22"/>
           <w:szCs w:val="22"/>
         </w:rPr>
-        <w:t xml:space="preserve">Columns with short text or numbers use fixed pixel widths — do NOT use flex percentages, they do not work reliably in Roll20. The total of all column widths should stay within ~815px (the visible sheet width).</w:t>
+        <w:t xml:space="preserve">Use fixed pixel widths for all columns — do NOT use flex percentages. The total of all column widths should stay within ~815px. The standard four-column layout totals 813px:</w:t>
       </w:r>
     </w:p>
     <w:p>
@@ -1486,14 +1486,14 @@
         </w:tblBorders>
       </w:tblPr>
       <w:tblGrid>
-        <w:gridCol w:w="2500"/>
-        <w:gridCol w:w="2000"/>
-        <w:gridCol w:w="4860"/>
+        <w:gridCol w:w="2400"/>
+        <w:gridCol w:w="1800"/>
+        <w:gridCol w:w="5160"/>
       </w:tblGrid>
       <w:tr>
         <w:tc>
           <w:tcPr>
-            <w:tcW w:type="dxa" w:w="2500"/>
+            <w:tcW w:type="dxa" w:w="2400"/>
             <w:tcBorders>
               <w:top w:val="single" w:color="00BFFF" w:sz="1"/>
               <w:left w:val="single" w:color="00BFFF" w:sz="1"/>
@@ -1528,7 +1528,7 @@
         </w:tc>
         <w:tc>
           <w:tcPr>
-            <w:tcW w:type="dxa" w:w="2000"/>
+            <w:tcW w:type="dxa" w:w="1800"/>
             <w:tcBorders>
               <w:top w:val="single" w:color="00BFFF" w:sz="1"/>
               <w:left w:val="single" w:color="00BFFF" w:sz="1"/>
@@ -1557,13 +1557,13 @@
                 <w:sz w:val="20"/>
                 <w:szCs w:val="20"/>
               </w:rPr>
-              <w:t xml:space="preserve">Suggested width</w:t>
-            </w:r>
-          </w:p>
-        </w:tc>
-        <w:tc>
-          <w:tcPr>
-            <w:tcW w:type="dxa" w:w="4860"/>
+              <w:t xml:space="preserve">Width</w:t>
+            </w:r>
+          </w:p>
+        </w:tc>
+        <w:tc>
+          <w:tcPr>
+            <w:tcW w:type="dxa" w:w="5160"/>
             <w:tcBorders>
               <w:top w:val="single" w:color="00BFFF" w:sz="1"/>
               <w:left w:val="single" w:color="00BFFF" w:sz="1"/>
@@ -1600,7 +1600,7 @@
       <w:tr>
         <w:tc>
           <w:tcPr>
-            <w:tcW w:type="dxa" w:w="2500"/>
+            <w:tcW w:type="dxa" w:w="2400"/>
             <w:tcBorders>
               <w:top w:val="single" w:color="00BFFF" w:sz="1"/>
               <w:left w:val="single" w:color="00BFFF" w:sz="1"/>
@@ -1632,7 +1632,7 @@
         </w:tc>
         <w:tc>
           <w:tcPr>
-            <w:tcW w:type="dxa" w:w="2000"/>
+            <w:tcW w:type="dxa" w:w="1800"/>
             <w:tcBorders>
               <w:top w:val="single" w:color="00BFFF" w:sz="1"/>
               <w:left w:val="single" w:color="00BFFF" w:sz="1"/>
@@ -1664,7 +1664,7 @@
         </w:tc>
         <w:tc>
           <w:tcPr>
-            <w:tcW w:type="dxa" w:w="4860"/>
+            <w:tcW w:type="dxa" w:w="5160"/>
             <w:tcBorders>
               <w:top w:val="single" w:color="00BFFF" w:sz="1"/>
               <w:left w:val="single" w:color="00BFFF" w:sz="1"/>
@@ -1690,7 +1690,7 @@
                 <w:sz w:val="20"/>
                 <w:szCs w:val="20"/>
               </w:rPr>
-              <w:t xml:space="preserve">Main item picker — clothing uses 190px</w:t>
+              <w:t xml:space="preserve">Main item picker</w:t>
             </w:r>
           </w:p>
         </w:tc>
@@ -1698,7 +1698,7 @@
       <w:tr>
         <w:tc>
           <w:tcPr>
-            <w:tcW w:type="dxa" w:w="2500"/>
+            <w:tcW w:type="dxa" w:w="2400"/>
             <w:tcBorders>
               <w:top w:val="single" w:color="00BFFF" w:sz="1"/>
               <w:left w:val="single" w:color="00BFFF" w:sz="1"/>
@@ -1724,13 +1724,13 @@
                 <w:sz w:val="20"/>
                 <w:szCs w:val="20"/>
               </w:rPr>
-              <w:t xml:space="preserve">Equipped checkbox</w:t>
-            </w:r>
-          </w:p>
-        </w:tc>
-        <w:tc>
-          <w:tcPr>
-            <w:tcW w:type="dxa" w:w="2000"/>
+              <w:t xml:space="preserve">Rarity</w:t>
+            </w:r>
+          </w:p>
+        </w:tc>
+        <w:tc>
+          <w:tcPr>
+            <w:tcW w:type="dxa" w:w="1800"/>
             <w:tcBorders>
               <w:top w:val="single" w:color="00BFFF" w:sz="1"/>
               <w:left w:val="single" w:color="00BFFF" w:sz="1"/>
@@ -1762,7 +1762,7 @@
         </w:tc>
         <w:tc>
           <w:tcPr>
-            <w:tcW w:type="dxa" w:w="4860"/>
+            <w:tcW w:type="dxa" w:w="5160"/>
             <w:tcBorders>
               <w:top w:val="single" w:color="00BFFF" w:sz="1"/>
               <w:left w:val="single" w:color="00BFFF" w:sz="1"/>
@@ -1788,7 +1788,7 @@
                 <w:sz w:val="20"/>
                 <w:szCs w:val="20"/>
               </w:rPr>
-              <w:t xml:space="preserve">Always 24px, matches armor section</w:t>
+              <w:t xml:space="preserve">Single letter abbreviation — C/P/R/I. text-align: center</w:t>
             </w:r>
           </w:p>
         </w:tc>
@@ -1796,7 +1796,7 @@
       <w:tr>
         <w:tc>
           <w:tcPr>
-            <w:tcW w:type="dxa" w:w="2500"/>
+            <w:tcW w:type="dxa" w:w="2400"/>
             <w:tcBorders>
               <w:top w:val="single" w:color="00BFFF" w:sz="1"/>
               <w:left w:val="single" w:color="00BFFF" w:sz="1"/>
@@ -1822,13 +1822,13 @@
                 <w:sz w:val="20"/>
                 <w:szCs w:val="20"/>
               </w:rPr>
-              <w:t xml:space="preserve">Effect / description</w:t>
-            </w:r>
-          </w:p>
-        </w:tc>
-        <w:tc>
-          <w:tcPr>
-            <w:tcW w:type="dxa" w:w="2000"/>
+              <w:t xml:space="preserve">Equipped checkbox</w:t>
+            </w:r>
+          </w:p>
+        </w:tc>
+        <w:tc>
+          <w:tcPr>
+            <w:tcW w:type="dxa" w:w="1800"/>
             <w:tcBorders>
               <w:top w:val="single" w:color="00BFFF" w:sz="1"/>
               <w:left w:val="single" w:color="00BFFF" w:sz="1"/>
@@ -1854,13 +1854,13 @@
                 <w:sz w:val="18"/>
                 <w:szCs w:val="18"/>
               </w:rPr>
-              <w:t xml:space="preserve">600px</w:t>
-            </w:r>
-          </w:p>
-        </w:tc>
-        <w:tc>
-          <w:tcPr>
-            <w:tcW w:type="dxa" w:w="4860"/>
+              <w:t xml:space="preserve">24px</w:t>
+            </w:r>
+          </w:p>
+        </w:tc>
+        <w:tc>
+          <w:tcPr>
+            <w:tcW w:type="dxa" w:w="5160"/>
             <w:tcBorders>
               <w:top w:val="single" w:color="00BFFF" w:sz="1"/>
               <w:left w:val="single" w:color="00BFFF" w:sz="1"/>
@@ -1886,7 +1886,7 @@
                 <w:sz w:val="20"/>
                 <w:szCs w:val="20"/>
               </w:rPr>
-              <w:t xml:space="preserve">Long text with ellipsis + tooltip; use tooltip pattern</w:t>
+              <w:t xml:space="preserve">Always 24px, matches armor section</w:t>
             </w:r>
           </w:p>
         </w:tc>
@@ -1894,7 +1894,7 @@
       <w:tr>
         <w:tc>
           <w:tcPr>
-            <w:tcW w:type="dxa" w:w="2500"/>
+            <w:tcW w:type="dxa" w:w="2400"/>
             <w:tcBorders>
               <w:top w:val="single" w:color="00BFFF" w:sz="1"/>
               <w:left w:val="single" w:color="00BFFF" w:sz="1"/>
@@ -1920,13 +1920,13 @@
                 <w:sz w:val="20"/>
                 <w:szCs w:val="20"/>
               </w:rPr>
-              <w:t xml:space="preserve">Short numeric</w:t>
-            </w:r>
-          </w:p>
-        </w:tc>
-        <w:tc>
-          <w:tcPr>
-            <w:tcW w:type="dxa" w:w="2000"/>
+              <w:t xml:space="preserve">Effect / description</w:t>
+            </w:r>
+          </w:p>
+        </w:tc>
+        <w:tc>
+          <w:tcPr>
+            <w:tcW w:type="dxa" w:w="1800"/>
             <w:tcBorders>
               <w:top w:val="single" w:color="00BFFF" w:sz="1"/>
               <w:left w:val="single" w:color="00BFFF" w:sz="1"/>
@@ -1952,13 +1952,13 @@
                 <w:sz w:val="18"/>
                 <w:szCs w:val="18"/>
               </w:rPr>
-              <w:t xml:space="preserve">60–80px</w:t>
-            </w:r>
-          </w:p>
-        </w:tc>
-        <w:tc>
-          <w:tcPr>
-            <w:tcW w:type="dxa" w:w="4860"/>
+              <w:t xml:space="preserve">575px</w:t>
+            </w:r>
+          </w:p>
+        </w:tc>
+        <w:tc>
+          <w:tcPr>
+            <w:tcW w:type="dxa" w:w="5160"/>
             <w:tcBorders>
               <w:top w:val="single" w:color="00BFFF" w:sz="1"/>
               <w:left w:val="single" w:color="00BFFF" w:sz="1"/>
@@ -1984,7 +1984,7 @@
                 <w:sz w:val="20"/>
                 <w:szCs w:val="20"/>
               </w:rPr>
-              <w:t xml:space="preserve">Cost, rating, charges, etc.</w:t>
+              <w:t xml:space="preserve">Truncated with ellipsis + hover tooltip. position: relative</w:t>
             </w:r>
           </w:p>
         </w:tc>
@@ -1992,7 +1992,7 @@
       <w:tr>
         <w:tc>
           <w:tcPr>
-            <w:tcW w:type="dxa" w:w="2500"/>
+            <w:tcW w:type="dxa" w:w="2400"/>
             <w:tcBorders>
               <w:top w:val="single" w:color="00BFFF" w:sz="1"/>
               <w:left w:val="single" w:color="00BFFF" w:sz="1"/>
@@ -2018,13 +2018,13 @@
                 <w:sz w:val="20"/>
                 <w:szCs w:val="20"/>
               </w:rPr>
-              <w:t xml:space="preserve">Short text</w:t>
-            </w:r>
-          </w:p>
-        </w:tc>
-        <w:tc>
-          <w:tcPr>
-            <w:tcW w:type="dxa" w:w="2000"/>
+              <w:t xml:space="preserve">Short numeric</w:t>
+            </w:r>
+          </w:p>
+        </w:tc>
+        <w:tc>
+          <w:tcPr>
+            <w:tcW w:type="dxa" w:w="1800"/>
             <w:tcBorders>
               <w:top w:val="single" w:color="00BFFF" w:sz="1"/>
               <w:left w:val="single" w:color="00BFFF" w:sz="1"/>
@@ -2050,13 +2050,13 @@
                 <w:sz w:val="18"/>
                 <w:szCs w:val="18"/>
               </w:rPr>
-              <w:t xml:space="preserve">100–160px</w:t>
-            </w:r>
-          </w:p>
-        </w:tc>
-        <w:tc>
-          <w:tcPr>
-            <w:tcW w:type="dxa" w:w="4860"/>
+              <w:t xml:space="preserve">60–80px</w:t>
+            </w:r>
+          </w:p>
+        </w:tc>
+        <w:tc>
+          <w:tcPr>
+            <w:tcW w:type="dxa" w:w="5160"/>
             <w:tcBorders>
               <w:top w:val="single" w:color="00BFFF" w:sz="1"/>
               <w:left w:val="single" w:color="00BFFF" w:sz="1"/>
@@ -2082,7 +2082,105 @@
                 <w:sz w:val="20"/>
                 <w:szCs w:val="20"/>
               </w:rPr>
-              <w:t xml:space="preserve">Rarity, category, skill ref</w:t>
+              <w:t xml:space="preserve">If replacing Effect — cost, rating, charges, etc.</w:t>
+            </w:r>
+          </w:p>
+        </w:tc>
+      </w:tr>
+      <w:tr>
+        <w:tc>
+          <w:tcPr>
+            <w:tcW w:type="dxa" w:w="2400"/>
+            <w:tcBorders>
+              <w:top w:val="single" w:color="00BFFF" w:sz="1"/>
+              <w:left w:val="single" w:color="00BFFF" w:sz="1"/>
+              <w:bottom w:val="single" w:color="00BFFF" w:sz="1"/>
+              <w:right w:val="single" w:color="00BFFF" w:sz="1"/>
+            </w:tcBorders>
+            <w:shd w:fill="0D0D1A" w:val="clear"/>
+            <w:tcMar>
+              <w:top w:type="dxa" w:w="60"/>
+              <w:left w:type="dxa" w:w="120"/>
+              <w:bottom w:type="dxa" w:w="60"/>
+              <w:right w:type="dxa" w:w="120"/>
+            </w:tcMar>
+          </w:tcPr>
+          <w:p>
+            <w:pPr>
+              <w:spacing w:after="0" w:before="0"/>
+            </w:pPr>
+            <w:r>
+              <w:rPr>
+                <w:rFonts w:ascii="Arial" w:cs="Arial" w:eastAsia="Arial" w:hAnsi="Arial"/>
+                <w:color w:val="C8C8C8"/>
+                <w:sz w:val="20"/>
+                <w:szCs w:val="20"/>
+              </w:rPr>
+              <w:t xml:space="preserve">Short text</w:t>
+            </w:r>
+          </w:p>
+        </w:tc>
+        <w:tc>
+          <w:tcPr>
+            <w:tcW w:type="dxa" w:w="1800"/>
+            <w:tcBorders>
+              <w:top w:val="single" w:color="00BFFF" w:sz="1"/>
+              <w:left w:val="single" w:color="00BFFF" w:sz="1"/>
+              <w:bottom w:val="single" w:color="00BFFF" w:sz="1"/>
+              <w:right w:val="single" w:color="00BFFF" w:sz="1"/>
+            </w:tcBorders>
+            <w:shd w:fill="0D0D1A" w:val="clear"/>
+            <w:tcMar>
+              <w:top w:type="dxa" w:w="60"/>
+              <w:left w:type="dxa" w:w="120"/>
+              <w:bottom w:type="dxa" w:w="60"/>
+              <w:right w:type="dxa" w:w="120"/>
+            </w:tcMar>
+          </w:tcPr>
+          <w:p>
+            <w:pPr>
+              <w:spacing w:after="0" w:before="0"/>
+            </w:pPr>
+            <w:r>
+              <w:rPr>
+                <w:rFonts w:ascii="Courier New" w:cs="Courier New" w:eastAsia="Courier New" w:hAnsi="Courier New"/>
+                <w:color w:val="CE9178"/>
+                <w:sz w:val="18"/>
+                <w:szCs w:val="18"/>
+              </w:rPr>
+              <w:t xml:space="preserve">100–160px</w:t>
+            </w:r>
+          </w:p>
+        </w:tc>
+        <w:tc>
+          <w:tcPr>
+            <w:tcW w:type="dxa" w:w="5160"/>
+            <w:tcBorders>
+              <w:top w:val="single" w:color="00BFFF" w:sz="1"/>
+              <w:left w:val="single" w:color="00BFFF" w:sz="1"/>
+              <w:bottom w:val="single" w:color="00BFFF" w:sz="1"/>
+              <w:right w:val="single" w:color="00BFFF" w:sz="1"/>
+            </w:tcBorders>
+            <w:shd w:fill="0D0D1A" w:val="clear"/>
+            <w:tcMar>
+              <w:top w:type="dxa" w:w="60"/>
+              <w:left w:type="dxa" w:w="120"/>
+              <w:bottom w:type="dxa" w:w="60"/>
+              <w:right w:type="dxa" w:w="120"/>
+            </w:tcMar>
+          </w:tcPr>
+          <w:p>
+            <w:pPr>
+              <w:spacing w:after="0" w:before="0"/>
+            </w:pPr>
+            <w:r>
+              <w:rPr>
+                <w:rFonts w:ascii="Arial" w:cs="Arial" w:eastAsia="Arial" w:hAnsi="Arial"/>
+                <w:color w:val="C8C8C8"/>
+                <w:sz w:val="20"/>
+                <w:szCs w:val="20"/>
+              </w:rPr>
+              <w:t xml:space="preserve">If replacing Effect — category, skill ref, etc.</w:t>
             </w:r>
           </w:p>
         </w:tc>
@@ -2151,7 +2249,7 @@
                 <w:sz w:val="20"/>
                 <w:szCs w:val="20"/>
               </w:rPr>
-              <w:t xml:space="preserve">Use width: Npx in CSS for all columns, not flex: N N N%. Flex sizing fights Roll20's global .flex-cell rules and produces inconsistent results.</w:t>
+              <w:t xml:space="preserve">Always adjust remaining column widths when adding or removing columns. The total must stay ~815px or content will overflow. When adding a 24px Rarity column, reduce the Effect column by 24px (e.g. 600px → 575px).</w:t>
             </w:r>
           </w:p>
         </w:tc>
@@ -2195,7 +2293,7 @@
           <w:sz w:val="22"/>
           <w:szCs w:val="22"/>
         </w:rPr>
-        <w:t xml:space="preserve">Add the data map object inside the &lt;script&gt; block, grouped with the other data maps (armorDataMap, clothingDataMap, etc.). Alphabetize the entries.</w:t>
+        <w:t xml:space="preserve">Add the data map object inside the &lt;script&gt; block, grouped with the other data maps. Alphabetize entries within the map.</w:t>
       </w:r>
     </w:p>
     <w:p>
@@ -2220,7 +2318,7 @@
           <w:sz w:val="28"/>
           <w:szCs w:val="28"/>
         </w:rPr>
-        <w:t xml:space="preserve">Minimum fields — effect-only section (like clothing)</w:t>
+        <w:t xml:space="preserve">Standard fields</w:t>
       </w:r>
     </w:p>
     <w:tbl>
@@ -2700,39 +2798,6 @@
         <w:t xml:space="preserve"/>
       </w:r>
     </w:p>
-    <w:p>
-      <w:pPr>
-        <w:pStyle w:val="Heading2"/>
-        <w:spacing w:after="120" w:before="240"/>
-      </w:pPr>
-      <w:r>
-        <w:rPr>
-          <w:rFonts w:ascii="Arial" w:cs="Arial" w:eastAsia="Arial" w:hAnsi="Arial"/>
-          <w:b/>
-          <w:bCs/>
-          <w:color w:val="00BFFF"/>
-          <w:sz w:val="28"/>
-          <w:szCs w:val="28"/>
-        </w:rPr>
-        <w:t xml:space="preserve">Extended fields — multi-column sections</w:t>
-      </w:r>
-    </w:p>
-    <w:p>
-      <w:pPr>
-        <w:spacing w:after="100" w:before="0"/>
-      </w:pPr>
-      <w:r>
-        <w:rPr>
-          <w:rFonts w:ascii="Arial" w:cs="Arial" w:eastAsia="Arial" w:hAnsi="Arial"/>
-          <w:b w:val="false"/>
-          <w:bCs w:val="false"/>
-          <w:color w:val="C8C8C8"/>
-          <w:sz w:val="22"/>
-          <w:szCs w:val="22"/>
-        </w:rPr>
-        <w:t xml:space="preserve">If your section needs more displayed columns (e.g. skill bonus, uses, charges), add those fields to each entry and corresponding i18n keys for their labels. Follow the armorDataMap pattern of pairing internal values with i18n keys:</w:t>
-      </w:r>
-    </w:p>
     <w:tbl>
       <w:tblPr>
         <w:tblW w:type="dxa" w:w="9360"/>
@@ -2758,274 +2823,37 @@
               <w:bottom w:val="single" w:color="00BFFF" w:sz="1"/>
               <w:right w:val="single" w:color="00BFFF" w:sz="1"/>
             </w:tcBorders>
-            <w:shd w:fill="0D0D1A" w:val="clear"/>
-            <w:tcMar>
-              <w:top w:type="dxa" w:w="120"/>
-              <w:left w:type="dxa" w:w="200"/>
-              <w:bottom w:type="dxa" w:w="120"/>
-              <w:right w:type="dxa" w:w="200"/>
-            </w:tcMar>
-          </w:tcPr>
-          <w:p>
-            <w:pPr>
-              <w:spacing w:after="0" w:before="0"/>
-            </w:pPr>
-            <w:r>
-              <w:rPr>
-                <w:rFonts w:ascii="Courier New" w:cs="Courier New" w:eastAsia="Courier New" w:hAnsi="Courier New"/>
-                <w:color w:val="E0E0E0"/>
-                <w:sz w:val="18"/>
-                <w:szCs w:val="18"/>
-              </w:rPr>
-              <w:t xml:space="preserve">	item_key: {</w:t>
-            </w:r>
-            <w:r>
-              <w:br/>
-              <w:t xml:space="preserve"/>
-            </w:r>
-            <w:r>
-              <w:rPr>
-                <w:rFonts w:ascii="Courier New" w:cs="Courier New" w:eastAsia="Courier New" w:hAnsi="Courier New"/>
-                <w:color w:val="E0E0E0"/>
-                <w:sz w:val="18"/>
-                <w:szCs w:val="18"/>
-              </w:rPr>
-              <w:t xml:space="preserve">		name_key:        </w:t>
-            </w:r>
-            <w:r>
-              <w:rPr>
-                <w:rFonts w:ascii="Courier New" w:cs="Courier New" w:eastAsia="Courier New" w:hAnsi="Courier New"/>
-                <w:color w:val="CE9178"/>
-                <w:sz w:val="18"/>
-                <w:szCs w:val="18"/>
-              </w:rPr>
-              <w:t xml:space="preserve">"SECTION_item_key-u"</w:t>
-            </w:r>
-            <w:r>
-              <w:rPr>
-                <w:rFonts w:ascii="Courier New" w:cs="Courier New" w:eastAsia="Courier New" w:hAnsi="Courier New"/>
-                <w:color w:val="E0E0E0"/>
-                <w:sz w:val="18"/>
-                <w:szCs w:val="18"/>
-              </w:rPr>
-              <w:t xml:space="preserve">,</w:t>
-            </w:r>
-            <w:r>
-              <w:br/>
-              <w:t xml:space="preserve"/>
-            </w:r>
-            <w:r>
-              <w:rPr>
-                <w:rFonts w:ascii="Courier New" w:cs="Courier New" w:eastAsia="Courier New" w:hAnsi="Courier New"/>
-                <w:color w:val="E0E0E0"/>
-                <w:sz w:val="18"/>
-                <w:szCs w:val="18"/>
-              </w:rPr>
-              <w:t xml:space="preserve">		cost:            500,</w:t>
-            </w:r>
-            <w:r>
-              <w:br/>
-              <w:t xml:space="preserve"/>
-            </w:r>
-            <w:r>
-              <w:rPr>
-                <w:rFonts w:ascii="Courier New" w:cs="Courier New" w:eastAsia="Courier New" w:hAnsi="Courier New"/>
-                <w:color w:val="E0E0E0"/>
-                <w:sz w:val="18"/>
-                <w:szCs w:val="18"/>
-              </w:rPr>
-              <w:t xml:space="preserve">		rarity:          </w:t>
-            </w:r>
-            <w:r>
-              <w:rPr>
-                <w:rFonts w:ascii="Courier New" w:cs="Courier New" w:eastAsia="Courier New" w:hAnsi="Courier New"/>
-                <w:color w:val="CE9178"/>
-                <w:sz w:val="18"/>
-                <w:szCs w:val="18"/>
-              </w:rPr>
-              <w:t xml:space="preserve">"permit"</w:t>
-            </w:r>
-            <w:r>
-              <w:rPr>
-                <w:rFonts w:ascii="Courier New" w:cs="Courier New" w:eastAsia="Courier New" w:hAnsi="Courier New"/>
-                <w:color w:val="E0E0E0"/>
-                <w:sz w:val="18"/>
-                <w:szCs w:val="18"/>
-              </w:rPr>
-              <w:t xml:space="preserve">,</w:t>
-            </w:r>
-            <w:r>
-              <w:br/>
-              <w:t xml:space="preserve"/>
-            </w:r>
-            <w:r>
-              <w:rPr>
-                <w:rFonts w:ascii="Courier New" w:cs="Courier New" w:eastAsia="Courier New" w:hAnsi="Courier New"/>
-                <w:color w:val="E0E0E0"/>
-                <w:sz w:val="18"/>
-                <w:szCs w:val="18"/>
-              </w:rPr>
-              <w:t xml:space="preserve">		skill_bonus_pct: 20,         // numeric value written directly to sheet attr</w:t>
-            </w:r>
-            <w:r>
-              <w:br/>
-              <w:t xml:space="preserve"/>
-            </w:r>
-            <w:r>
-              <w:rPr>
-                <w:rFonts w:ascii="Courier New" w:cs="Courier New" w:eastAsia="Courier New" w:hAnsi="Courier New"/>
-                <w:color w:val="E0E0E0"/>
-                <w:sz w:val="18"/>
-                <w:szCs w:val="18"/>
-              </w:rPr>
-              <w:t xml:space="preserve">		skill:           </w:t>
-            </w:r>
-            <w:r>
-              <w:rPr>
-                <w:rFonts w:ascii="Courier New" w:cs="Courier New" w:eastAsia="Courier New" w:hAnsi="Courier New"/>
-                <w:color w:val="CE9178"/>
-                <w:sz w:val="18"/>
-                <w:szCs w:val="18"/>
-              </w:rPr>
-              <w:t xml:space="preserve">"security_systems"</w:t>
-            </w:r>
-            <w:r>
-              <w:rPr>
-                <w:rFonts w:ascii="Courier New" w:cs="Courier New" w:eastAsia="Courier New" w:hAnsi="Courier New"/>
-                <w:color w:val="E0E0E0"/>
-                <w:sz w:val="18"/>
-                <w:szCs w:val="18"/>
-              </w:rPr>
-              <w:t xml:space="preserve">,</w:t>
-            </w:r>
-            <w:r>
-              <w:br/>
-              <w:t xml:space="preserve"/>
-            </w:r>
-            <w:r>
-              <w:rPr>
-                <w:rFonts w:ascii="Courier New" w:cs="Courier New" w:eastAsia="Courier New" w:hAnsi="Courier New"/>
-                <w:color w:val="E0E0E0"/>
-                <w:sz w:val="18"/>
-                <w:szCs w:val="18"/>
-              </w:rPr>
-              <w:t xml:space="preserve">		effect_key:      </w:t>
-            </w:r>
-            <w:r>
-              <w:rPr>
-                <w:rFonts w:ascii="Courier New" w:cs="Courier New" w:eastAsia="Courier New" w:hAnsi="Courier New"/>
-                <w:color w:val="CE9178"/>
-                <w:sz w:val="18"/>
-                <w:szCs w:val="18"/>
-              </w:rPr>
-              <w:t xml:space="preserve">"SECTION_item_key_effect-u"</w:t>
-            </w:r>
-            <w:r>
-              <w:rPr>
-                <w:rFonts w:ascii="Courier New" w:cs="Courier New" w:eastAsia="Courier New" w:hAnsi="Courier New"/>
-                <w:color w:val="E0E0E0"/>
-                <w:sz w:val="18"/>
-                <w:szCs w:val="18"/>
-              </w:rPr>
-              <w:t xml:space="preserve">,</w:t>
-            </w:r>
-            <w:r>
-              <w:br/>
-              <w:t xml:space="preserve"/>
-            </w:r>
-            <w:r>
-              <w:rPr>
-                <w:rFonts w:ascii="Courier New" w:cs="Courier New" w:eastAsia="Courier New" w:hAnsi="Courier New"/>
-                <w:color w:val="E0E0E0"/>
-                <w:sz w:val="18"/>
-                <w:szCs w:val="18"/>
-              </w:rPr>
-              <w:t xml:space="preserve">		source: { doc: </w:t>
-            </w:r>
-            <w:r>
-              <w:rPr>
-                <w:rFonts w:ascii="Courier New" w:cs="Courier New" w:eastAsia="Courier New" w:hAnsi="Courier New"/>
-                <w:color w:val="CE9178"/>
-                <w:sz w:val="18"/>
-                <w:szCs w:val="18"/>
-              </w:rPr>
-              <w:t xml:space="preserve">"gear_loadout-u"</w:t>
-            </w:r>
-            <w:r>
-              <w:rPr>
-                <w:rFonts w:ascii="Courier New" w:cs="Courier New" w:eastAsia="Courier New" w:hAnsi="Courier New"/>
-                <w:color w:val="E0E0E0"/>
-                <w:sz w:val="18"/>
-                <w:szCs w:val="18"/>
-              </w:rPr>
-              <w:t xml:space="preserve">, version: </w:t>
-            </w:r>
-            <w:r>
-              <w:rPr>
-                <w:rFonts w:ascii="Courier New" w:cs="Courier New" w:eastAsia="Courier New" w:hAnsi="Courier New"/>
-                <w:color w:val="CE9178"/>
-                <w:sz w:val="18"/>
-                <w:szCs w:val="18"/>
-              </w:rPr>
-              <w:t xml:space="preserve">"2.260327"</w:t>
-            </w:r>
-            <w:r>
-              <w:rPr>
-                <w:rFonts w:ascii="Courier New" w:cs="Courier New" w:eastAsia="Courier New" w:hAnsi="Courier New"/>
-                <w:color w:val="E0E0E0"/>
-                <w:sz w:val="18"/>
-                <w:szCs w:val="18"/>
-              </w:rPr>
-              <w:t xml:space="preserve">, date: </w:t>
-            </w:r>
-            <w:r>
-              <w:rPr>
-                <w:rFonts w:ascii="Courier New" w:cs="Courier New" w:eastAsia="Courier New" w:hAnsi="Courier New"/>
-                <w:color w:val="CE9178"/>
-                <w:sz w:val="18"/>
-                <w:szCs w:val="18"/>
-              </w:rPr>
-              <w:t xml:space="preserve">"2026-03-27"</w:t>
-            </w:r>
-            <w:r>
-              <w:rPr>
-                <w:rFonts w:ascii="Courier New" w:cs="Courier New" w:eastAsia="Courier New" w:hAnsi="Courier New"/>
-                <w:color w:val="E0E0E0"/>
-                <w:sz w:val="18"/>
-                <w:szCs w:val="18"/>
-              </w:rPr>
-              <w:t xml:space="preserve">, section: </w:t>
-            </w:r>
-            <w:r>
-              <w:rPr>
-                <w:rFonts w:ascii="Courier New" w:cs="Courier New" w:eastAsia="Courier New" w:hAnsi="Courier New"/>
-                <w:color w:val="CE9178"/>
-                <w:sz w:val="18"/>
-                <w:szCs w:val="18"/>
-              </w:rPr>
-              <w:t xml:space="preserve">"SECTION_source-u"</w:t>
-            </w:r>
-            <w:r>
-              <w:rPr>
-                <w:rFonts w:ascii="Courier New" w:cs="Courier New" w:eastAsia="Courier New" w:hAnsi="Courier New"/>
-                <w:color w:val="E0E0E0"/>
-                <w:sz w:val="18"/>
-                <w:szCs w:val="18"/>
-              </w:rPr>
-              <w:t xml:space="preserve"> },</w:t>
-            </w:r>
-            <w:r>
-              <w:br/>
-              <w:t xml:space="preserve"/>
-            </w:r>
-            <w:r>
-              <w:rPr>
-                <w:rFonts w:ascii="Courier New" w:cs="Courier New" w:eastAsia="Courier New" w:hAnsi="Courier New"/>
-                <w:color w:val="E0E0E0"/>
-                <w:sz w:val="18"/>
-                <w:szCs w:val="18"/>
-              </w:rPr>
-              <w:t xml:space="preserve">	},</w:t>
+            <w:shd w:fill="16213E" w:val="clear"/>
+            <w:tcMar>
+              <w:top w:type="dxa" w:w="80"/>
+              <w:left w:type="dxa" w:w="160"/>
+              <w:bottom w:type="dxa" w:w="80"/>
+              <w:right w:type="dxa" w:w="160"/>
+            </w:tcMar>
+          </w:tcPr>
+          <w:p>
+            <w:pPr>
+              <w:spacing w:after="0" w:before="0"/>
+            </w:pPr>
+            <w:r>
+              <w:rPr>
+                <w:rFonts w:ascii="Arial" w:cs="Arial" w:eastAsia="Arial" w:hAnsi="Arial"/>
+                <w:b/>
+                <w:bCs/>
+                <w:color w:val="FFD700"/>
+                <w:sz w:val="20"/>
+                <w:szCs w:val="20"/>
+              </w:rPr>
+              <w:t xml:space="preserve">RARITY VALUES  </w:t>
+            </w:r>
+            <w:r>
+              <w:rPr>
+                <w:rFonts w:ascii="Arial" w:cs="Arial" w:eastAsia="Arial" w:hAnsi="Arial"/>
+                <w:color w:val="C8C8C8"/>
+                <w:sz w:val="20"/>
+                <w:szCs w:val="20"/>
+              </w:rPr>
+              <w:t xml:space="preserve">Must be exactly one of: "common", "permit", "restricted", "illegal". The rarityAbbrevKey map (already in the codebase) converts these to C/P/R/I via i18n.</w:t>
             </w:r>
           </w:p>
         </w:tc>
@@ -3069,7 +2897,7 @@
           <w:sz w:val="22"/>
           <w:szCs w:val="22"/>
         </w:rPr>
-        <w:t xml:space="preserve">Add all keys in alphabetical order within the file. Every key the section uses must be present. Missing keys show the raw key string in Roll20 instead of translated text.</w:t>
+        <w:t xml:space="preserve">Add all keys in alphabetical order within the file. The four rarity abbreviation keys and rarity-u header key are already in the codebase — do not add them again.</w:t>
       </w:r>
     </w:p>
     <w:p>
@@ -3301,6 +3129,46 @@
                 <w:sz w:val="18"/>
                 <w:szCs w:val="18"/>
               </w:rPr>
+              <w:t xml:space="preserve">"SECTION_rarity-u"</w:t>
+            </w:r>
+            <w:r>
+              <w:rPr>
+                <w:rFonts w:ascii="Courier New" w:cs="Courier New" w:eastAsia="Courier New" w:hAnsi="Courier New"/>
+                <w:color w:val="E0E0E0"/>
+                <w:sz w:val="18"/>
+                <w:szCs w:val="18"/>
+              </w:rPr>
+              <w:t xml:space="preserve">: </w:t>
+            </w:r>
+            <w:r>
+              <w:rPr>
+                <w:rFonts w:ascii="Courier New" w:cs="Courier New" w:eastAsia="Courier New" w:hAnsi="Courier New"/>
+                <w:color w:val="CE9178"/>
+                <w:sz w:val="18"/>
+                <w:szCs w:val="18"/>
+              </w:rPr>
+              <w:t xml:space="preserve">"R"</w:t>
+            </w:r>
+            <w:r>
+              <w:rPr>
+                <w:rFonts w:ascii="Courier New" w:cs="Courier New" w:eastAsia="Courier New" w:hAnsi="Courier New"/>
+                <w:color w:val="E0E0E0"/>
+                <w:sz w:val="18"/>
+                <w:szCs w:val="18"/>
+              </w:rPr>
+              <w:t xml:space="preserve">,</w:t>
+            </w:r>
+            <w:r>
+              <w:br/>
+              <w:t xml:space="preserve"/>
+            </w:r>
+            <w:r>
+              <w:rPr>
+                <w:rFonts w:ascii="Courier New" w:cs="Courier New" w:eastAsia="Courier New" w:hAnsi="Courier New"/>
+                <w:color w:val="CE9178"/>
+                <w:sz w:val="18"/>
+                <w:szCs w:val="18"/>
+              </w:rPr>
               <w:t xml:space="preserve">"SECTION_select_placeholder-u"</w:t>
             </w:r>
             <w:r>
@@ -3399,22 +3267,6 @@
         <w:t xml:space="preserve">Per-item keys</w:t>
       </w:r>
     </w:p>
-    <w:p>
-      <w:pPr>
-        <w:spacing w:after="100" w:before="0"/>
-      </w:pPr>
-      <w:r>
-        <w:rPr>
-          <w:rFonts w:ascii="Arial" w:cs="Arial" w:eastAsia="Arial" w:hAnsi="Arial"/>
-          <w:b w:val="false"/>
-          <w:bCs w:val="false"/>
-          <w:color w:val="C8C8C8"/>
-          <w:sz w:val="22"/>
-          <w:szCs w:val="22"/>
-        </w:rPr>
-        <w:t xml:space="preserve">Each item needs a name key. Items with effects need an effect key. Name the effect key after the item key with _effect appended:</w:t>
-      </w:r>
-    </w:p>
     <w:tbl>
       <w:tblPr>
         <w:tblW w:type="dxa" w:w="9360"/>
@@ -3586,7 +3438,7 @@
                 <w:sz w:val="20"/>
                 <w:szCs w:val="20"/>
               </w:rPr>
-              <w:t xml:space="preserve">ALPHABETICAL ORDER  </w:t>
+              <w:t xml:space="preserve">NOTE  </w:t>
             </w:r>
             <w:r>
               <w:rPr>
@@ -3595,7 +3447,76 @@
                 <w:sz w:val="20"/>
                 <w:szCs w:val="20"/>
               </w:rPr>
-              <w:t xml:space="preserve">translation.json must stay alphabetically ordered. Insert new keys at the correct position — do not append to the end of the file or the section.</w:t>
+              <w:t xml:space="preserve">The column header for rarity uses the shared "rarity-u" key (value: "R"), not a section-specific key. The SECTION_rarity-u key above is not needed unless you want a different header label for your section.</w:t>
+            </w:r>
+          </w:p>
+        </w:tc>
+      </w:tr>
+    </w:tbl>
+    <w:p>
+      <w:pPr>
+        <w:spacing w:after="80" w:before="0"/>
+      </w:pPr>
+      <w:r>
+        <w:t xml:space="preserve"/>
+      </w:r>
+    </w:p>
+    <w:tbl>
+      <w:tblPr>
+        <w:tblW w:type="dxa" w:w="9360"/>
+        <w:tblBorders>
+          <w:top w:val="single" w:color="auto" w:sz="4"/>
+          <w:left w:val="single" w:color="auto" w:sz="4"/>
+          <w:bottom w:val="single" w:color="auto" w:sz="4"/>
+          <w:right w:val="single" w:color="auto" w:sz="4"/>
+          <w:insideH w:val="single" w:color="auto" w:sz="4"/>
+          <w:insideV w:val="single" w:color="auto" w:sz="4"/>
+        </w:tblBorders>
+      </w:tblPr>
+      <w:tblGrid>
+        <w:gridCol w:w="9360"/>
+      </w:tblGrid>
+      <w:tr>
+        <w:tc>
+          <w:tcPr>
+            <w:tcW w:type="dxa" w:w="9360"/>
+            <w:tcBorders>
+              <w:top w:val="single" w:color="00BFFF" w:sz="1"/>
+              <w:left w:val="single" w:color="00BFFF" w:sz="1"/>
+              <w:bottom w:val="single" w:color="00BFFF" w:sz="1"/>
+              <w:right w:val="single" w:color="00BFFF" w:sz="1"/>
+            </w:tcBorders>
+            <w:shd w:fill="16213E" w:val="clear"/>
+            <w:tcMar>
+              <w:top w:type="dxa" w:w="80"/>
+              <w:left w:type="dxa" w:w="160"/>
+              <w:bottom w:type="dxa" w:w="80"/>
+              <w:right w:type="dxa" w:w="160"/>
+            </w:tcMar>
+          </w:tcPr>
+          <w:p>
+            <w:pPr>
+              <w:spacing w:after="0" w:before="0"/>
+            </w:pPr>
+            <w:r>
+              <w:rPr>
+                <w:rFonts w:ascii="Arial" w:cs="Arial" w:eastAsia="Arial" w:hAnsi="Arial"/>
+                <w:b/>
+                <w:bCs/>
+                <w:color w:val="FFD700"/>
+                <w:sz w:val="20"/>
+                <w:szCs w:val="20"/>
+              </w:rPr>
+              <w:t xml:space="preserve">ALPHABETICAL ORDER  </w:t>
+            </w:r>
+            <w:r>
+              <w:rPr>
+                <w:rFonts w:ascii="Arial" w:cs="Arial" w:eastAsia="Arial" w:hAnsi="Arial"/>
+                <w:color w:val="C8C8C8"/>
+                <w:sz w:val="20"/>
+                <w:szCs w:val="20"/>
+              </w:rPr>
+              <w:t xml:space="preserve">translation.json must stay alphabetically ordered. Insert new keys at the correct position — do not append to the end.</w:t>
             </w:r>
           </w:p>
         </w:tc>
@@ -3639,7 +3560,7 @@
           <w:sz w:val="22"/>
           <w:szCs w:val="22"/>
         </w:rPr>
-        <w:t xml:space="preserve">Add the CSS block inside the Gear Tab Collapsible Sections area, after the existing clothing block and before the Spenders Section Layout comment. Copy the clothing pattern exactly and substitute your column names and widths.</w:t>
+        <w:t xml:space="preserve">Add the CSS block inside the Gear Tab Collapsible Sections area, after the previous section's block and before the Spenders Section Layout comment.</w:t>
       </w:r>
     </w:p>
     <w:p>
@@ -3720,6 +3641,19 @@
                 <w:sz w:val="18"/>
                 <w:szCs w:val="18"/>
               </w:rPr>
+              <w:t xml:space="preserve">.ui-dialog .tab-content .charsheet .SECTION-rarity   { width: 24px; text-align: center; }</w:t>
+            </w:r>
+            <w:r>
+              <w:br/>
+              <w:t xml:space="preserve"/>
+            </w:r>
+            <w:r>
+              <w:rPr>
+                <w:rFonts w:ascii="Courier New" w:cs="Courier New" w:eastAsia="Courier New" w:hAnsi="Courier New"/>
+                <w:color w:val="E0E0E0"/>
+                <w:sz w:val="18"/>
+                <w:szCs w:val="18"/>
+              </w:rPr>
               <w:t xml:space="preserve">.ui-dialog .tab-content .charsheet .SECTION-equipped { width: 24px; }</w:t>
             </w:r>
             <w:r>
@@ -3733,7 +3667,7 @@
                 <w:sz w:val="18"/>
                 <w:szCs w:val="18"/>
               </w:rPr>
-              <w:t xml:space="preserve">.ui-dialog .tab-content .charsheet .SECTION-effect   { width: 600px; position: relative; }</w:t>
+              <w:t xml:space="preserve">.ui-dialog .tab-content .charsheet .SECTION-effect   { width: 575px; position: relative; }</w:t>
             </w:r>
             <w:r>
               <w:br/>
@@ -4325,7 +4259,7 @@
                 <w:sz w:val="20"/>
                 <w:szCs w:val="20"/>
               </w:rPr>
-              <w:t xml:space="preserve">Do NOT use overflow: hidden on the effect cell or the tooltip wrapper — it clips the absolutely-positioned tooltip bubble before it can render.</w:t>
+              <w:t xml:space="preserve">Do NOT set overflow: hidden on the effect cell or tooltip wrapper — it clips the absolutely-positioned tooltip bubble. Only the preview div gets overflow: hidden.</w:t>
             </w:r>
           </w:p>
         </w:tc>
@@ -4369,7 +4303,7 @@
           <w:sz w:val="22"/>
           <w:szCs w:val="22"/>
         </w:rPr>
-        <w:t xml:space="preserve">Add the new section inside the sheet-gear tab div, after the closing &lt;/div&gt; of the previous section. The collapsible wrapper, header, two static rows, and repeating fieldset are all required.</w:t>
+        <w:t xml:space="preserve">Add the new section inside the sheet-gear tab div, after the closing &lt;/div&gt; of the previous section. The Rarity cell sits between the name cell and the equipped checkbox in every row.</w:t>
       </w:r>
     </w:p>
     <w:p>
@@ -4916,6 +4850,55 @@
                 <w:sz w:val="18"/>
                 <w:szCs w:val="18"/>
               </w:rPr>
+              <w:t xml:space="preserve">"flex-cell SECTION-rarity"</w:t>
+            </w:r>
+            <w:r>
+              <w:rPr>
+                <w:rFonts w:ascii="Courier New" w:cs="Courier New" w:eastAsia="Courier New" w:hAnsi="Courier New"/>
+                <w:color w:val="E0E0E0"/>
+                <w:sz w:val="18"/>
+                <w:szCs w:val="18"/>
+              </w:rPr>
+              <w:t xml:space="preserve">&gt;&lt;span data-i18n=</w:t>
+            </w:r>
+            <w:r>
+              <w:rPr>
+                <w:rFonts w:ascii="Courier New" w:cs="Courier New" w:eastAsia="Courier New" w:hAnsi="Courier New"/>
+                <w:color w:val="CE9178"/>
+                <w:sz w:val="18"/>
+                <w:szCs w:val="18"/>
+              </w:rPr>
+              <w:t xml:space="preserve">"rarity-u"</w:t>
+            </w:r>
+            <w:r>
+              <w:rPr>
+                <w:rFonts w:ascii="Courier New" w:cs="Courier New" w:eastAsia="Courier New" w:hAnsi="Courier New"/>
+                <w:color w:val="E0E0E0"/>
+                <w:sz w:val="18"/>
+                <w:szCs w:val="18"/>
+              </w:rPr>
+              <w:t xml:space="preserve">&gt;R&lt;/span&gt;&lt;/div&gt;</w:t>
+            </w:r>
+            <w:r>
+              <w:br/>
+              <w:t xml:space="preserve"/>
+            </w:r>
+            <w:r>
+              <w:rPr>
+                <w:rFonts w:ascii="Courier New" w:cs="Courier New" w:eastAsia="Courier New" w:hAnsi="Courier New"/>
+                <w:color w:val="E0E0E0"/>
+                <w:sz w:val="18"/>
+                <w:szCs w:val="18"/>
+              </w:rPr>
+              <w:t xml:space="preserve">					&lt;div class=</w:t>
+            </w:r>
+            <w:r>
+              <w:rPr>
+                <w:rFonts w:ascii="Courier New" w:cs="Courier New" w:eastAsia="Courier New" w:hAnsi="Courier New"/>
+                <w:color w:val="CE9178"/>
+                <w:sz w:val="18"/>
+                <w:szCs w:val="18"/>
+              </w:rPr>
               <w:t xml:space="preserve">"flex-cell SECTION-equipped"</w:t>
             </w:r>
             <w:r>
@@ -5328,6 +5311,55 @@
                 <w:sz w:val="18"/>
                 <w:szCs w:val="18"/>
               </w:rPr>
+              <w:t xml:space="preserve">"flex-cell SECTION-rarity"</w:t>
+            </w:r>
+            <w:r>
+              <w:rPr>
+                <w:rFonts w:ascii="Courier New" w:cs="Courier New" w:eastAsia="Courier New" w:hAnsi="Courier New"/>
+                <w:color w:val="E0E0E0"/>
+                <w:sz w:val="18"/>
+                <w:szCs w:val="18"/>
+              </w:rPr>
+              <w:t xml:space="preserve">&gt;&lt;span name=</w:t>
+            </w:r>
+            <w:r>
+              <w:rPr>
+                <w:rFonts w:ascii="Courier New" w:cs="Courier New" w:eastAsia="Courier New" w:hAnsi="Courier New"/>
+                <w:color w:val="CE9178"/>
+                <w:sz w:val="18"/>
+                <w:szCs w:val="18"/>
+              </w:rPr>
+              <w:t xml:space="preserve">"attr_SECTION1_rarity"</w:t>
+            </w:r>
+            <w:r>
+              <w:rPr>
+                <w:rFonts w:ascii="Courier New" w:cs="Courier New" w:eastAsia="Courier New" w:hAnsi="Courier New"/>
+                <w:color w:val="E0E0E0"/>
+                <w:sz w:val="18"/>
+                <w:szCs w:val="18"/>
+              </w:rPr>
+              <w:t xml:space="preserve">&gt;&lt;/span&gt;&lt;/div&gt;</w:t>
+            </w:r>
+            <w:r>
+              <w:br/>
+              <w:t xml:space="preserve"/>
+            </w:r>
+            <w:r>
+              <w:rPr>
+                <w:rFonts w:ascii="Courier New" w:cs="Courier New" w:eastAsia="Courier New" w:hAnsi="Courier New"/>
+                <w:color w:val="E0E0E0"/>
+                <w:sz w:val="18"/>
+                <w:szCs w:val="18"/>
+              </w:rPr>
+              <w:t xml:space="preserve">					&lt;div class=</w:t>
+            </w:r>
+            <w:r>
+              <w:rPr>
+                <w:rFonts w:ascii="Courier New" w:cs="Courier New" w:eastAsia="Courier New" w:hAnsi="Courier New"/>
+                <w:color w:val="CE9178"/>
+                <w:sz w:val="18"/>
+                <w:szCs w:val="18"/>
+              </w:rPr>
               <w:t xml:space="preserve">"flex-cell SECTION-equipped"</w:t>
             </w:r>
             <w:r>
@@ -5660,6 +5692,67 @@
                 <w:sz w:val="18"/>
                 <w:szCs w:val="18"/>
               </w:rPr>
+              <w:t xml:space="preserve">				&lt;!-- Second static row: SECTION2 — same structure, attrs end in 2 --&gt;</w:t>
+            </w:r>
+            <w:r>
+              <w:br/>
+              <w:t xml:space="preserve"/>
+            </w:r>
+            <w:r>
+              <w:rPr>
+                <w:rFonts w:ascii="Courier New" w:cs="Courier New" w:eastAsia="Courier New" w:hAnsi="Courier New"/>
+                <w:color w:val="E0E0E0"/>
+                <w:sz w:val="18"/>
+                <w:szCs w:val="18"/>
+              </w:rPr>
+              <w:t xml:space="preserve">			&lt;/div&gt;</w:t>
+            </w:r>
+            <w:r>
+              <w:br/>
+              <w:t xml:space="preserve"/>
+            </w:r>
+            <w:r>
+              <w:br/>
+              <w:t xml:space="preserve"/>
+            </w:r>
+            <w:r>
+              <w:rPr>
+                <w:rFonts w:ascii="Courier New" w:cs="Courier New" w:eastAsia="Courier New" w:hAnsi="Courier New"/>
+                <w:color w:val="E0E0E0"/>
+                <w:sz w:val="18"/>
+                <w:szCs w:val="18"/>
+              </w:rPr>
+              <w:t xml:space="preserve">			&lt;fieldset class=</w:t>
+            </w:r>
+            <w:r>
+              <w:rPr>
+                <w:rFonts w:ascii="Courier New" w:cs="Courier New" w:eastAsia="Courier New" w:hAnsi="Courier New"/>
+                <w:color w:val="CE9178"/>
+                <w:sz w:val="18"/>
+                <w:szCs w:val="18"/>
+              </w:rPr>
+              <w:t xml:space="preserve">"repeating_SECTIONgear"</w:t>
+            </w:r>
+            <w:r>
+              <w:rPr>
+                <w:rFonts w:ascii="Courier New" w:cs="Courier New" w:eastAsia="Courier New" w:hAnsi="Courier New"/>
+                <w:color w:val="E0E0E0"/>
+                <w:sz w:val="18"/>
+                <w:szCs w:val="18"/>
+              </w:rPr>
+              <w:t xml:space="preserve">&gt;</w:t>
+            </w:r>
+            <w:r>
+              <w:br/>
+              <w:t xml:space="preserve"/>
+            </w:r>
+            <w:r>
+              <w:rPr>
+                <w:rFonts w:ascii="Courier New" w:cs="Courier New" w:eastAsia="Courier New" w:hAnsi="Courier New"/>
+                <w:color w:val="E0E0E0"/>
+                <w:sz w:val="18"/>
+                <w:szCs w:val="18"/>
+              </w:rPr>
               <w:t xml:space="preserve">				&lt;div class=</w:t>
             </w:r>
             <w:r>
@@ -5691,59 +5784,16 @@
                 <w:sz w:val="18"/>
                 <w:szCs w:val="18"/>
               </w:rPr>
-              <w:t xml:space="preserve">					&lt;!-- Second static row: SECTION2 — same structure, attrs end in 2 --&gt;</w:t>
-            </w:r>
-            <w:r>
-              <w:br/>
-              <w:t xml:space="preserve"/>
-            </w:r>
-            <w:r>
-              <w:rPr>
-                <w:rFonts w:ascii="Courier New" w:cs="Courier New" w:eastAsia="Courier New" w:hAnsi="Courier New"/>
-                <w:color w:val="E0E0E0"/>
-                <w:sz w:val="18"/>
-                <w:szCs w:val="18"/>
-              </w:rPr>
-              <w:t xml:space="preserve">				&lt;/div&gt;</w:t>
-            </w:r>
-            <w:r>
-              <w:br/>
-              <w:t xml:space="preserve"/>
-            </w:r>
-            <w:r>
-              <w:rPr>
-                <w:rFonts w:ascii="Courier New" w:cs="Courier New" w:eastAsia="Courier New" w:hAnsi="Courier New"/>
-                <w:color w:val="E0E0E0"/>
-                <w:sz w:val="18"/>
-                <w:szCs w:val="18"/>
-              </w:rPr>
-              <w:t xml:space="preserve">			&lt;/div&gt;</w:t>
-            </w:r>
-            <w:r>
-              <w:br/>
-              <w:t xml:space="preserve"/>
-            </w:r>
-            <w:r>
-              <w:br/>
-              <w:t xml:space="preserve"/>
-            </w:r>
-            <w:r>
-              <w:rPr>
-                <w:rFonts w:ascii="Courier New" w:cs="Courier New" w:eastAsia="Courier New" w:hAnsi="Courier New"/>
-                <w:color w:val="E0E0E0"/>
-                <w:sz w:val="18"/>
-                <w:szCs w:val="18"/>
-              </w:rPr>
-              <w:t xml:space="preserve">			&lt;fieldset class=</w:t>
-            </w:r>
-            <w:r>
-              <w:rPr>
-                <w:rFonts w:ascii="Courier New" w:cs="Courier New" w:eastAsia="Courier New" w:hAnsi="Courier New"/>
-                <w:color w:val="CE9178"/>
-                <w:sz w:val="18"/>
-                <w:szCs w:val="18"/>
-              </w:rPr>
-              <w:t xml:space="preserve">"repeating_SECTIONgear"</w:t>
+              <w:t xml:space="preserve">					&lt;div class=</w:t>
+            </w:r>
+            <w:r>
+              <w:rPr>
+                <w:rFonts w:ascii="Courier New" w:cs="Courier New" w:eastAsia="Courier New" w:hAnsi="Courier New"/>
+                <w:color w:val="CE9178"/>
+                <w:sz w:val="18"/>
+                <w:szCs w:val="18"/>
+              </w:rPr>
+              <w:t xml:space="preserve">"flex-cell SECTION-name"</w:t>
             </w:r>
             <w:r>
               <w:rPr>
@@ -5765,16 +5815,52 @@
                 <w:sz w:val="18"/>
                 <w:szCs w:val="18"/>
               </w:rPr>
-              <w:t xml:space="preserve">				&lt;div class=</w:t>
-            </w:r>
-            <w:r>
-              <w:rPr>
-                <w:rFonts w:ascii="Courier New" w:cs="Courier New" w:eastAsia="Courier New" w:hAnsi="Courier New"/>
-                <w:color w:val="CE9178"/>
-                <w:sz w:val="18"/>
-                <w:szCs w:val="18"/>
-              </w:rPr>
-              <w:t xml:space="preserve">"flex-row"</w:t>
+              <w:t xml:space="preserve">						&lt;select name=</w:t>
+            </w:r>
+            <w:r>
+              <w:rPr>
+                <w:rFonts w:ascii="Courier New" w:cs="Courier New" w:eastAsia="Courier New" w:hAnsi="Courier New"/>
+                <w:color w:val="CE9178"/>
+                <w:sz w:val="18"/>
+                <w:szCs w:val="18"/>
+              </w:rPr>
+              <w:t xml:space="preserve">"attr_SECTION_preset"</w:t>
+            </w:r>
+            <w:r>
+              <w:rPr>
+                <w:rFonts w:ascii="Courier New" w:cs="Courier New" w:eastAsia="Courier New" w:hAnsi="Courier New"/>
+                <w:color w:val="E0E0E0"/>
+                <w:sz w:val="18"/>
+                <w:szCs w:val="18"/>
+              </w:rPr>
+              <w:t xml:space="preserve"> class=</w:t>
+            </w:r>
+            <w:r>
+              <w:rPr>
+                <w:rFonts w:ascii="Courier New" w:cs="Courier New" w:eastAsia="Courier New" w:hAnsi="Courier New"/>
+                <w:color w:val="CE9178"/>
+                <w:sz w:val="18"/>
+                <w:szCs w:val="18"/>
+              </w:rPr>
+              <w:t xml:space="preserve">"sheet-armor-preset-select"</w:t>
+            </w:r>
+            <w:r>
+              <w:rPr>
+                <w:rFonts w:ascii="Courier New" w:cs="Courier New" w:eastAsia="Courier New" w:hAnsi="Courier New"/>
+                <w:color w:val="E0E0E0"/>
+                <w:sz w:val="18"/>
+                <w:szCs w:val="18"/>
+              </w:rPr>
+              <w:t xml:space="preserve"> data-i18n-title=</w:t>
+            </w:r>
+            <w:r>
+              <w:rPr>
+                <w:rFonts w:ascii="Courier New" w:cs="Courier New" w:eastAsia="Courier New" w:hAnsi="Courier New"/>
+                <w:color w:val="CE9178"/>
+                <w:sz w:val="18"/>
+                <w:szCs w:val="18"/>
+              </w:rPr>
+              <w:t xml:space="preserve">"SECTION_preset-u"</w:t>
             </w:r>
             <w:r>
               <w:rPr>
@@ -5796,6 +5882,130 @@
                 <w:sz w:val="18"/>
                 <w:szCs w:val="18"/>
               </w:rPr>
+              <w:t xml:space="preserve">							&lt;option value=</w:t>
+            </w:r>
+            <w:r>
+              <w:rPr>
+                <w:rFonts w:ascii="Courier New" w:cs="Courier New" w:eastAsia="Courier New" w:hAnsi="Courier New"/>
+                <w:color w:val="CE9178"/>
+                <w:sz w:val="18"/>
+                <w:szCs w:val="18"/>
+              </w:rPr>
+              <w:t xml:space="preserve">""</w:t>
+            </w:r>
+            <w:r>
+              <w:rPr>
+                <w:rFonts w:ascii="Courier New" w:cs="Courier New" w:eastAsia="Courier New" w:hAnsi="Courier New"/>
+                <w:color w:val="E0E0E0"/>
+                <w:sz w:val="18"/>
+                <w:szCs w:val="18"/>
+              </w:rPr>
+              <w:t xml:space="preserve"> data-i18n=</w:t>
+            </w:r>
+            <w:r>
+              <w:rPr>
+                <w:rFonts w:ascii="Courier New" w:cs="Courier New" w:eastAsia="Courier New" w:hAnsi="Courier New"/>
+                <w:color w:val="CE9178"/>
+                <w:sz w:val="18"/>
+                <w:szCs w:val="18"/>
+              </w:rPr>
+              <w:t xml:space="preserve">"SECTION_select_placeholder-u"</w:t>
+            </w:r>
+            <w:r>
+              <w:rPr>
+                <w:rFonts w:ascii="Courier New" w:cs="Courier New" w:eastAsia="Courier New" w:hAnsi="Courier New"/>
+                <w:color w:val="E0E0E0"/>
+                <w:sz w:val="18"/>
+                <w:szCs w:val="18"/>
+              </w:rPr>
+              <w:t xml:space="preserve">&gt;--- select item ---&lt;/option&gt;</w:t>
+            </w:r>
+            <w:r>
+              <w:br/>
+              <w:t xml:space="preserve"/>
+            </w:r>
+            <w:r>
+              <w:rPr>
+                <w:rFonts w:ascii="Courier New" w:cs="Courier New" w:eastAsia="Courier New" w:hAnsi="Courier New"/>
+                <w:color w:val="E0E0E0"/>
+                <w:sz w:val="18"/>
+                <w:szCs w:val="18"/>
+              </w:rPr>
+              <w:t xml:space="preserve">							&lt;option value=</w:t>
+            </w:r>
+            <w:r>
+              <w:rPr>
+                <w:rFonts w:ascii="Courier New" w:cs="Courier New" w:eastAsia="Courier New" w:hAnsi="Courier New"/>
+                <w:color w:val="CE9178"/>
+                <w:sz w:val="18"/>
+                <w:szCs w:val="18"/>
+              </w:rPr>
+              <w:t xml:space="preserve">"item_key"</w:t>
+            </w:r>
+            <w:r>
+              <w:rPr>
+                <w:rFonts w:ascii="Courier New" w:cs="Courier New" w:eastAsia="Courier New" w:hAnsi="Courier New"/>
+                <w:color w:val="E0E0E0"/>
+                <w:sz w:val="18"/>
+                <w:szCs w:val="18"/>
+              </w:rPr>
+              <w:t xml:space="preserve"> data-i18n=</w:t>
+            </w:r>
+            <w:r>
+              <w:rPr>
+                <w:rFonts w:ascii="Courier New" w:cs="Courier New" w:eastAsia="Courier New" w:hAnsi="Courier New"/>
+                <w:color w:val="CE9178"/>
+                <w:sz w:val="18"/>
+                <w:szCs w:val="18"/>
+              </w:rPr>
+              <w:t xml:space="preserve">"SECTION_item_key-u"</w:t>
+            </w:r>
+            <w:r>
+              <w:rPr>
+                <w:rFonts w:ascii="Courier New" w:cs="Courier New" w:eastAsia="Courier New" w:hAnsi="Courier New"/>
+                <w:color w:val="E0E0E0"/>
+                <w:sz w:val="18"/>
+                <w:szCs w:val="18"/>
+              </w:rPr>
+              <w:t xml:space="preserve">&gt;Item Name&lt;/option&gt;</w:t>
+            </w:r>
+            <w:r>
+              <w:br/>
+              <w:t xml:space="preserve"/>
+            </w:r>
+            <w:r>
+              <w:rPr>
+                <w:rFonts w:ascii="Courier New" w:cs="Courier New" w:eastAsia="Courier New" w:hAnsi="Courier New"/>
+                <w:color w:val="E0E0E0"/>
+                <w:sz w:val="18"/>
+                <w:szCs w:val="18"/>
+              </w:rPr>
+              <w:t xml:space="preserve">						&lt;/select&gt;</w:t>
+            </w:r>
+            <w:r>
+              <w:br/>
+              <w:t xml:space="preserve"/>
+            </w:r>
+            <w:r>
+              <w:rPr>
+                <w:rFonts w:ascii="Courier New" w:cs="Courier New" w:eastAsia="Courier New" w:hAnsi="Courier New"/>
+                <w:color w:val="E0E0E0"/>
+                <w:sz w:val="18"/>
+                <w:szCs w:val="18"/>
+              </w:rPr>
+              <w:t xml:space="preserve">					&lt;/div&gt;</w:t>
+            </w:r>
+            <w:r>
+              <w:br/>
+              <w:t xml:space="preserve"/>
+            </w:r>
+            <w:r>
+              <w:rPr>
+                <w:rFonts w:ascii="Courier New" w:cs="Courier New" w:eastAsia="Courier New" w:hAnsi="Courier New"/>
+                <w:color w:val="E0E0E0"/>
+                <w:sz w:val="18"/>
+                <w:szCs w:val="18"/>
+              </w:rPr>
               <w:t xml:space="preserve">					&lt;div class=</w:t>
             </w:r>
             <w:r>
@@ -5805,207 +6015,34 @@
                 <w:sz w:val="18"/>
                 <w:szCs w:val="18"/>
               </w:rPr>
-              <w:t xml:space="preserve">"flex-cell SECTION-name"</w:t>
-            </w:r>
-            <w:r>
-              <w:rPr>
-                <w:rFonts w:ascii="Courier New" w:cs="Courier New" w:eastAsia="Courier New" w:hAnsi="Courier New"/>
-                <w:color w:val="E0E0E0"/>
-                <w:sz w:val="18"/>
-                <w:szCs w:val="18"/>
-              </w:rPr>
-              <w:t xml:space="preserve">&gt;</w:t>
-            </w:r>
-            <w:r>
-              <w:br/>
-              <w:t xml:space="preserve"/>
-            </w:r>
-            <w:r>
-              <w:rPr>
-                <w:rFonts w:ascii="Courier New" w:cs="Courier New" w:eastAsia="Courier New" w:hAnsi="Courier New"/>
-                <w:color w:val="E0E0E0"/>
-                <w:sz w:val="18"/>
-                <w:szCs w:val="18"/>
-              </w:rPr>
-              <w:t xml:space="preserve">						&lt;select name=</w:t>
-            </w:r>
-            <w:r>
-              <w:rPr>
-                <w:rFonts w:ascii="Courier New" w:cs="Courier New" w:eastAsia="Courier New" w:hAnsi="Courier New"/>
-                <w:color w:val="CE9178"/>
-                <w:sz w:val="18"/>
-                <w:szCs w:val="18"/>
-              </w:rPr>
-              <w:t xml:space="preserve">"attr_SECTION_preset"</w:t>
-            </w:r>
-            <w:r>
-              <w:rPr>
-                <w:rFonts w:ascii="Courier New" w:cs="Courier New" w:eastAsia="Courier New" w:hAnsi="Courier New"/>
-                <w:color w:val="E0E0E0"/>
-                <w:sz w:val="18"/>
-                <w:szCs w:val="18"/>
-              </w:rPr>
-              <w:t xml:space="preserve"> class=</w:t>
-            </w:r>
-            <w:r>
-              <w:rPr>
-                <w:rFonts w:ascii="Courier New" w:cs="Courier New" w:eastAsia="Courier New" w:hAnsi="Courier New"/>
-                <w:color w:val="CE9178"/>
-                <w:sz w:val="18"/>
-                <w:szCs w:val="18"/>
-              </w:rPr>
-              <w:t xml:space="preserve">"sheet-armor-preset-select"</w:t>
-            </w:r>
-            <w:r>
-              <w:rPr>
-                <w:rFonts w:ascii="Courier New" w:cs="Courier New" w:eastAsia="Courier New" w:hAnsi="Courier New"/>
-                <w:color w:val="E0E0E0"/>
-                <w:sz w:val="18"/>
-                <w:szCs w:val="18"/>
-              </w:rPr>
-              <w:t xml:space="preserve"> data-i18n-title=</w:t>
-            </w:r>
-            <w:r>
-              <w:rPr>
-                <w:rFonts w:ascii="Courier New" w:cs="Courier New" w:eastAsia="Courier New" w:hAnsi="Courier New"/>
-                <w:color w:val="CE9178"/>
-                <w:sz w:val="18"/>
-                <w:szCs w:val="18"/>
-              </w:rPr>
-              <w:t xml:space="preserve">"SECTION_preset-u"</w:t>
-            </w:r>
-            <w:r>
-              <w:rPr>
-                <w:rFonts w:ascii="Courier New" w:cs="Courier New" w:eastAsia="Courier New" w:hAnsi="Courier New"/>
-                <w:color w:val="E0E0E0"/>
-                <w:sz w:val="18"/>
-                <w:szCs w:val="18"/>
-              </w:rPr>
-              <w:t xml:space="preserve">&gt;</w:t>
-            </w:r>
-            <w:r>
-              <w:br/>
-              <w:t xml:space="preserve"/>
-            </w:r>
-            <w:r>
-              <w:rPr>
-                <w:rFonts w:ascii="Courier New" w:cs="Courier New" w:eastAsia="Courier New" w:hAnsi="Courier New"/>
-                <w:color w:val="E0E0E0"/>
-                <w:sz w:val="18"/>
-                <w:szCs w:val="18"/>
-              </w:rPr>
-              <w:t xml:space="preserve">							&lt;option value=</w:t>
-            </w:r>
-            <w:r>
-              <w:rPr>
-                <w:rFonts w:ascii="Courier New" w:cs="Courier New" w:eastAsia="Courier New" w:hAnsi="Courier New"/>
-                <w:color w:val="CE9178"/>
-                <w:sz w:val="18"/>
-                <w:szCs w:val="18"/>
-              </w:rPr>
-              <w:t xml:space="preserve">""</w:t>
-            </w:r>
-            <w:r>
-              <w:rPr>
-                <w:rFonts w:ascii="Courier New" w:cs="Courier New" w:eastAsia="Courier New" w:hAnsi="Courier New"/>
-                <w:color w:val="E0E0E0"/>
-                <w:sz w:val="18"/>
-                <w:szCs w:val="18"/>
-              </w:rPr>
-              <w:t xml:space="preserve"> data-i18n=</w:t>
-            </w:r>
-            <w:r>
-              <w:rPr>
-                <w:rFonts w:ascii="Courier New" w:cs="Courier New" w:eastAsia="Courier New" w:hAnsi="Courier New"/>
-                <w:color w:val="CE9178"/>
-                <w:sz w:val="18"/>
-                <w:szCs w:val="18"/>
-              </w:rPr>
-              <w:t xml:space="preserve">"SECTION_select_placeholder-u"</w:t>
-            </w:r>
-            <w:r>
-              <w:rPr>
-                <w:rFonts w:ascii="Courier New" w:cs="Courier New" w:eastAsia="Courier New" w:hAnsi="Courier New"/>
-                <w:color w:val="E0E0E0"/>
-                <w:sz w:val="18"/>
-                <w:szCs w:val="18"/>
-              </w:rPr>
-              <w:t xml:space="preserve">&gt;--- select item ---&lt;/option&gt;</w:t>
-            </w:r>
-            <w:r>
-              <w:br/>
-              <w:t xml:space="preserve"/>
-            </w:r>
-            <w:r>
-              <w:rPr>
-                <w:rFonts w:ascii="Courier New" w:cs="Courier New" w:eastAsia="Courier New" w:hAnsi="Courier New"/>
-                <w:color w:val="E0E0E0"/>
-                <w:sz w:val="18"/>
-                <w:szCs w:val="18"/>
-              </w:rPr>
-              <w:t xml:space="preserve">							&lt;option value=</w:t>
-            </w:r>
-            <w:r>
-              <w:rPr>
-                <w:rFonts w:ascii="Courier New" w:cs="Courier New" w:eastAsia="Courier New" w:hAnsi="Courier New"/>
-                <w:color w:val="CE9178"/>
-                <w:sz w:val="18"/>
-                <w:szCs w:val="18"/>
-              </w:rPr>
-              <w:t xml:space="preserve">"item_key"</w:t>
-            </w:r>
-            <w:r>
-              <w:rPr>
-                <w:rFonts w:ascii="Courier New" w:cs="Courier New" w:eastAsia="Courier New" w:hAnsi="Courier New"/>
-                <w:color w:val="E0E0E0"/>
-                <w:sz w:val="18"/>
-                <w:szCs w:val="18"/>
-              </w:rPr>
-              <w:t xml:space="preserve"> data-i18n=</w:t>
-            </w:r>
-            <w:r>
-              <w:rPr>
-                <w:rFonts w:ascii="Courier New" w:cs="Courier New" w:eastAsia="Courier New" w:hAnsi="Courier New"/>
-                <w:color w:val="CE9178"/>
-                <w:sz w:val="18"/>
-                <w:szCs w:val="18"/>
-              </w:rPr>
-              <w:t xml:space="preserve">"SECTION_item_key-u"</w:t>
-            </w:r>
-            <w:r>
-              <w:rPr>
-                <w:rFonts w:ascii="Courier New" w:cs="Courier New" w:eastAsia="Courier New" w:hAnsi="Courier New"/>
-                <w:color w:val="E0E0E0"/>
-                <w:sz w:val="18"/>
-                <w:szCs w:val="18"/>
-              </w:rPr>
-              <w:t xml:space="preserve">&gt;Item Name&lt;/option&gt;</w:t>
-            </w:r>
-            <w:r>
-              <w:br/>
-              <w:t xml:space="preserve"/>
-            </w:r>
-            <w:r>
-              <w:rPr>
-                <w:rFonts w:ascii="Courier New" w:cs="Courier New" w:eastAsia="Courier New" w:hAnsi="Courier New"/>
-                <w:color w:val="E0E0E0"/>
-                <w:sz w:val="18"/>
-                <w:szCs w:val="18"/>
-              </w:rPr>
-              <w:t xml:space="preserve">						&lt;/select&gt;</w:t>
-            </w:r>
-            <w:r>
-              <w:br/>
-              <w:t xml:space="preserve"/>
-            </w:r>
-            <w:r>
-              <w:rPr>
-                <w:rFonts w:ascii="Courier New" w:cs="Courier New" w:eastAsia="Courier New" w:hAnsi="Courier New"/>
-                <w:color w:val="E0E0E0"/>
-                <w:sz w:val="18"/>
-                <w:szCs w:val="18"/>
-              </w:rPr>
-              <w:t xml:space="preserve">					&lt;/div&gt;</w:t>
+              <w:t xml:space="preserve">"flex-cell SECTION-rarity"</w:t>
+            </w:r>
+            <w:r>
+              <w:rPr>
+                <w:rFonts w:ascii="Courier New" w:cs="Courier New" w:eastAsia="Courier New" w:hAnsi="Courier New"/>
+                <w:color w:val="E0E0E0"/>
+                <w:sz w:val="18"/>
+                <w:szCs w:val="18"/>
+              </w:rPr>
+              <w:t xml:space="preserve">&gt;&lt;span name=</w:t>
+            </w:r>
+            <w:r>
+              <w:rPr>
+                <w:rFonts w:ascii="Courier New" w:cs="Courier New" w:eastAsia="Courier New" w:hAnsi="Courier New"/>
+                <w:color w:val="CE9178"/>
+                <w:sz w:val="18"/>
+                <w:szCs w:val="18"/>
+              </w:rPr>
+              <w:t xml:space="preserve">"attr_SECTION_rarity"</w:t>
+            </w:r>
+            <w:r>
+              <w:rPr>
+                <w:rFonts w:ascii="Courier New" w:cs="Courier New" w:eastAsia="Courier New" w:hAnsi="Courier New"/>
+                <w:color w:val="E0E0E0"/>
+                <w:sz w:val="18"/>
+                <w:szCs w:val="18"/>
+              </w:rPr>
+              <w:t xml:space="preserve">&gt;&lt;/span&gt;&lt;/div&gt;</w:t>
             </w:r>
             <w:r>
               <w:br/>
@@ -6462,7 +6499,7 @@
                 <w:sz w:val="20"/>
                 <w:szCs w:val="20"/>
               </w:rPr>
-              <w:t xml:space="preserve">CRITICAL  </w:t>
+              <w:t xml:space="preserve">CRITICAL — EFFECT PREVIEW  </w:t>
             </w:r>
             <w:r>
               <w:rPr>
@@ -6471,7 +6508,7 @@
                 <w:sz w:val="20"/>
                 <w:szCs w:val="20"/>
               </w:rPr>
-              <w:t xml:space="preserve">The effect preview uses a &lt;div class="SECTION-effect-preview"&gt; wrapper around a plain &lt;span name="attr_..."&gt;. Do NOT put class= on the named span itself — Roll20 ignores extra attributes on sheet-worker-bound spans.</w:t>
+              <w:t xml:space="preserve">The preview uses a &lt;div class="SECTION-effect-preview"&gt; wrapper around a plain &lt;span name="attr_..."&gt;. Do NOT put class= on the named span itself — Roll20 ignores extra attributes on sheet-worker-bound spans.</w:t>
             </w:r>
           </w:p>
         </w:tc>
@@ -6531,7 +6568,7 @@
                 <w:sz w:val="20"/>
                 <w:szCs w:val="20"/>
               </w:rPr>
-              <w:t xml:space="preserve">CRITICAL  </w:t>
+              <w:t xml:space="preserve">CRITICAL — TOOLTIP BUBBLE  </w:t>
             </w:r>
             <w:r>
               <w:rPr>
@@ -6540,7 +6577,76 @@
                 <w:sz w:val="20"/>
                 <w:szCs w:val="20"/>
               </w:rPr>
-              <w:t xml:space="preserve">The tooltip bubble contains a second &lt;span name="attr_SECTION_effect"&gt; with no class. Roll20 updates all named spans in the row simultaneously, so both the preview and the tooltip bubble show the same text.</w:t>
+              <w:t xml:space="preserve">Contains a second &lt;span name="attr_SECTION_effect"&gt; with no class. Roll20 updates all matching named spans in the row simultaneously so both the preview and the bubble always show the same text.</w:t>
+            </w:r>
+          </w:p>
+        </w:tc>
+      </w:tr>
+    </w:tbl>
+    <w:p>
+      <w:pPr>
+        <w:spacing w:after="80" w:before="0"/>
+      </w:pPr>
+      <w:r>
+        <w:t xml:space="preserve"/>
+      </w:r>
+    </w:p>
+    <w:tbl>
+      <w:tblPr>
+        <w:tblW w:type="dxa" w:w="9360"/>
+        <w:tblBorders>
+          <w:top w:val="single" w:color="auto" w:sz="4"/>
+          <w:left w:val="single" w:color="auto" w:sz="4"/>
+          <w:bottom w:val="single" w:color="auto" w:sz="4"/>
+          <w:right w:val="single" w:color="auto" w:sz="4"/>
+          <w:insideH w:val="single" w:color="auto" w:sz="4"/>
+          <w:insideV w:val="single" w:color="auto" w:sz="4"/>
+        </w:tblBorders>
+      </w:tblPr>
+      <w:tblGrid>
+        <w:gridCol w:w="9360"/>
+      </w:tblGrid>
+      <w:tr>
+        <w:tc>
+          <w:tcPr>
+            <w:tcW w:type="dxa" w:w="9360"/>
+            <w:tcBorders>
+              <w:top w:val="single" w:color="00BFFF" w:sz="1"/>
+              <w:left w:val="single" w:color="00BFFF" w:sz="1"/>
+              <w:bottom w:val="single" w:color="00BFFF" w:sz="1"/>
+              <w:right w:val="single" w:color="00BFFF" w:sz="1"/>
+            </w:tcBorders>
+            <w:shd w:fill="16213E" w:val="clear"/>
+            <w:tcMar>
+              <w:top w:type="dxa" w:w="80"/>
+              <w:left w:type="dxa" w:w="160"/>
+              <w:bottom w:type="dxa" w:w="80"/>
+              <w:right w:type="dxa" w:w="160"/>
+            </w:tcMar>
+          </w:tcPr>
+          <w:p>
+            <w:pPr>
+              <w:spacing w:after="0" w:before="0"/>
+            </w:pPr>
+            <w:r>
+              <w:rPr>
+                <w:rFonts w:ascii="Arial" w:cs="Arial" w:eastAsia="Arial" w:hAnsi="Arial"/>
+                <w:b/>
+                <w:bCs/>
+                <w:color w:val="FFD700"/>
+                <w:sz w:val="20"/>
+                <w:szCs w:val="20"/>
+              </w:rPr>
+              <w:t xml:space="preserve">CRITICAL — RARITY CELL  </w:t>
+            </w:r>
+            <w:r>
+              <w:rPr>
+                <w:rFonts w:ascii="Arial" w:cs="Arial" w:eastAsia="Arial" w:hAnsi="Arial"/>
+                <w:color w:val="C8C8C8"/>
+                <w:sz w:val="20"/>
+                <w:szCs w:val="20"/>
+              </w:rPr>
+              <w:t xml:space="preserve">The rarity span is a plain named span with no wrapper div needed — it only displays a single letter and does not need truncation or tooltip.</w:t>
             </w:r>
           </w:p>
         </w:tc>
@@ -6584,7 +6690,7 @@
           <w:sz w:val="22"/>
           <w:szCs w:val="22"/>
         </w:rPr>
-        <w:t xml:space="preserve">Three additions required: the two apply functions, the three change watchers, and the init function. Place them in the same relative positions as the clothing equivalents.</w:t>
+        <w:t xml:space="preserve">Three additions: the two apply functions, the three change watchers, and the init function.</w:t>
       </w:r>
     </w:p>
     <w:p>
@@ -6625,7 +6731,88 @@
           <w:sz w:val="22"/>
           <w:szCs w:val="22"/>
         </w:rPr>
-        <w:t xml:space="preserve">Place immediately after applyClothingPresetStatic, before the applyGrenadePreset comment block.</w:t>
+        <w:t xml:space="preserve">Place after applyClothingPresetStatic / applyDisguisePresetStatic (whichever is last), before the applyGrenadePreset comment.</w:t>
+      </w:r>
+    </w:p>
+    <w:p>
+      <w:pPr>
+        <w:spacing w:after="80" w:before="0"/>
+      </w:pPr>
+      <w:r>
+        <w:t xml:space="preserve"/>
+      </w:r>
+    </w:p>
+    <w:p>
+      <w:pPr>
+        <w:spacing w:after="100" w:before="0"/>
+      </w:pPr>
+      <w:r>
+        <w:rPr>
+          <w:rFonts w:ascii="Arial" w:cs="Arial" w:eastAsia="Arial" w:hAnsi="Arial"/>
+          <w:b/>
+          <w:bCs/>
+          <w:color w:val="C8C8C8"/>
+          <w:sz w:val="22"/>
+          <w:szCs w:val="22"/>
+        </w:rPr>
+        <w:t xml:space="preserve">Key rules:</w:t>
+      </w:r>
+    </w:p>
+    <w:p>
+      <w:pPr>
+        <w:pStyle w:val="ListParagraph"/>
+        <w:numPr>
+          <w:ilvl w:val="0"/>
+          <w:numId w:val="2"/>
+        </w:numPr>
+        <w:spacing w:after="60" w:before="0"/>
+      </w:pPr>
+      <w:r>
+        <w:rPr>
+          <w:rFonts w:ascii="Arial" w:cs="Arial" w:eastAsia="Arial" w:hAnsi="Arial"/>
+          <w:color w:val="C8C8C8"/>
+          <w:sz w:val="22"/>
+          <w:szCs w:val="22"/>
+        </w:rPr>
+        <w:t xml:space="preserve">Do NOT use if (!entry) return — this prevents clearing fields when the user deselects.</w:t>
+      </w:r>
+    </w:p>
+    <w:p>
+      <w:pPr>
+        <w:pStyle w:val="ListParagraph"/>
+        <w:numPr>
+          <w:ilvl w:val="0"/>
+          <w:numId w:val="2"/>
+        </w:numPr>
+        <w:spacing w:after="60" w:before="0"/>
+      </w:pPr>
+      <w:r>
+        <w:rPr>
+          <w:rFonts w:ascii="Arial" w:cs="Arial" w:eastAsia="Arial" w:hAnsi="Arial"/>
+          <w:color w:val="C8C8C8"/>
+          <w:sz w:val="22"/>
+          <w:szCs w:val="22"/>
+        </w:rPr>
+        <w:t xml:space="preserve">Always call setAttrs unconditionally — pass empty strings when entry is null.</w:t>
+      </w:r>
+    </w:p>
+    <w:p>
+      <w:pPr>
+        <w:pStyle w:val="ListParagraph"/>
+        <w:numPr>
+          <w:ilvl w:val="0"/>
+          <w:numId w:val="2"/>
+        </w:numPr>
+        <w:spacing w:after="60" w:before="0"/>
+      </w:pPr>
+      <w:r>
+        <w:rPr>
+          <w:rFonts w:ascii="Arial" w:cs="Arial" w:eastAsia="Arial" w:hAnsi="Arial"/>
+          <w:color w:val="C8C8C8"/>
+          <w:sz w:val="22"/>
+          <w:szCs w:val="22"/>
+        </w:rPr>
+        <w:t xml:space="preserve">rarityAbbrevKey is already defined in the codebase. Do not redefine it.</w:t>
       </w:r>
     </w:p>
     <w:p>
@@ -6773,16 +6960,65 @@
                 <w:sz w:val="18"/>
                 <w:szCs w:val="18"/>
               </w:rPr>
-              <w:t xml:space="preserve">if</w:t>
-            </w:r>
-            <w:r>
-              <w:rPr>
-                <w:rFonts w:ascii="Courier New" w:cs="Courier New" w:eastAsia="Courier New" w:hAnsi="Courier New"/>
-                <w:color w:val="E0E0E0"/>
-                <w:sz w:val="18"/>
-                <w:szCs w:val="18"/>
-              </w:rPr>
-              <w:t xml:space="preserve"> (!entry) </w:t>
+              <w:t xml:space="preserve">const</w:t>
+            </w:r>
+            <w:r>
+              <w:rPr>
+                <w:rFonts w:ascii="Courier New" w:cs="Courier New" w:eastAsia="Courier New" w:hAnsi="Courier New"/>
+                <w:color w:val="E0E0E0"/>
+                <w:sz w:val="18"/>
+                <w:szCs w:val="18"/>
+              </w:rPr>
+              <w:t xml:space="preserve"> tr = (k) =&gt; (k &amp;&amp; typeof getTranslationByKey === </w:t>
+            </w:r>
+            <w:r>
+              <w:rPr>
+                <w:rFonts w:ascii="Courier New" w:cs="Courier New" w:eastAsia="Courier New" w:hAnsi="Courier New"/>
+                <w:color w:val="CE9178"/>
+                <w:sz w:val="18"/>
+                <w:szCs w:val="18"/>
+              </w:rPr>
+              <w:t xml:space="preserve">"function"</w:t>
+            </w:r>
+            <w:r>
+              <w:rPr>
+                <w:rFonts w:ascii="Courier New" w:cs="Courier New" w:eastAsia="Courier New" w:hAnsi="Courier New"/>
+                <w:color w:val="E0E0E0"/>
+                <w:sz w:val="18"/>
+                <w:szCs w:val="18"/>
+              </w:rPr>
+              <w:t xml:space="preserve">) ? (getTranslationByKey(k) || k) : (k || </w:t>
+            </w:r>
+            <w:r>
+              <w:rPr>
+                <w:rFonts w:ascii="Courier New" w:cs="Courier New" w:eastAsia="Courier New" w:hAnsi="Courier New"/>
+                <w:color w:val="CE9178"/>
+                <w:sz w:val="18"/>
+                <w:szCs w:val="18"/>
+              </w:rPr>
+              <w:t xml:space="preserve">""</w:t>
+            </w:r>
+            <w:r>
+              <w:rPr>
+                <w:rFonts w:ascii="Courier New" w:cs="Courier New" w:eastAsia="Courier New" w:hAnsi="Courier New"/>
+                <w:color w:val="E0E0E0"/>
+                <w:sz w:val="18"/>
+                <w:szCs w:val="18"/>
+              </w:rPr>
+              <w:t xml:space="preserve">);</w:t>
+            </w:r>
+            <w:r>
+              <w:br/>
+              <w:t xml:space="preserve"/>
+            </w:r>
+            <w:r>
+              <w:rPr>
+                <w:rFonts w:ascii="Courier New" w:cs="Courier New" w:eastAsia="Courier New" w:hAnsi="Courier New"/>
+                <w:color w:val="E0E0E0"/>
+                <w:sz w:val="18"/>
+                <w:szCs w:val="18"/>
+              </w:rPr>
+              <w:t xml:space="preserve">	</w:t>
             </w:r>
             <w:r>
               <w:rPr>
@@ -6791,7 +7027,317 @@
                 <w:sz w:val="18"/>
                 <w:szCs w:val="18"/>
               </w:rPr>
-              <w:t xml:space="preserve">return</w:t>
+              <w:t xml:space="preserve">setAttrs</w:t>
+            </w:r>
+            <w:r>
+              <w:rPr>
+                <w:rFonts w:ascii="Courier New" w:cs="Courier New" w:eastAsia="Courier New" w:hAnsi="Courier New"/>
+                <w:color w:val="E0E0E0"/>
+                <w:sz w:val="18"/>
+                <w:szCs w:val="18"/>
+              </w:rPr>
+              <w:t xml:space="preserve">({</w:t>
+            </w:r>
+            <w:r>
+              <w:br/>
+              <w:t xml:space="preserve"/>
+            </w:r>
+            <w:r>
+              <w:rPr>
+                <w:rFonts w:ascii="Courier New" w:cs="Courier New" w:eastAsia="Courier New" w:hAnsi="Courier New"/>
+                <w:color w:val="E0E0E0"/>
+                <w:sz w:val="18"/>
+                <w:szCs w:val="18"/>
+              </w:rPr>
+              <w:t xml:space="preserve">		[p + </w:t>
+            </w:r>
+            <w:r>
+              <w:rPr>
+                <w:rFonts w:ascii="Courier New" w:cs="Courier New" w:eastAsia="Courier New" w:hAnsi="Courier New"/>
+                <w:color w:val="CE9178"/>
+                <w:sz w:val="18"/>
+                <w:szCs w:val="18"/>
+              </w:rPr>
+              <w:t xml:space="preserve">"SECTION_effect"</w:t>
+            </w:r>
+            <w:r>
+              <w:rPr>
+                <w:rFonts w:ascii="Courier New" w:cs="Courier New" w:eastAsia="Courier New" w:hAnsi="Courier New"/>
+                <w:color w:val="E0E0E0"/>
+                <w:sz w:val="18"/>
+                <w:szCs w:val="18"/>
+              </w:rPr>
+              <w:t xml:space="preserve">]: entry &amp;&amp; entry.effect_key ? tr(entry.effect_key) : </w:t>
+            </w:r>
+            <w:r>
+              <w:rPr>
+                <w:rFonts w:ascii="Courier New" w:cs="Courier New" w:eastAsia="Courier New" w:hAnsi="Courier New"/>
+                <w:color w:val="CE9178"/>
+                <w:sz w:val="18"/>
+                <w:szCs w:val="18"/>
+              </w:rPr>
+              <w:t xml:space="preserve">""</w:t>
+            </w:r>
+            <w:r>
+              <w:rPr>
+                <w:rFonts w:ascii="Courier New" w:cs="Courier New" w:eastAsia="Courier New" w:hAnsi="Courier New"/>
+                <w:color w:val="E0E0E0"/>
+                <w:sz w:val="18"/>
+                <w:szCs w:val="18"/>
+              </w:rPr>
+              <w:t xml:space="preserve">,</w:t>
+            </w:r>
+            <w:r>
+              <w:br/>
+              <w:t xml:space="preserve"/>
+            </w:r>
+            <w:r>
+              <w:rPr>
+                <w:rFonts w:ascii="Courier New" w:cs="Courier New" w:eastAsia="Courier New" w:hAnsi="Courier New"/>
+                <w:color w:val="E0E0E0"/>
+                <w:sz w:val="18"/>
+                <w:szCs w:val="18"/>
+              </w:rPr>
+              <w:t xml:space="preserve">		[p + </w:t>
+            </w:r>
+            <w:r>
+              <w:rPr>
+                <w:rFonts w:ascii="Courier New" w:cs="Courier New" w:eastAsia="Courier New" w:hAnsi="Courier New"/>
+                <w:color w:val="CE9178"/>
+                <w:sz w:val="18"/>
+                <w:szCs w:val="18"/>
+              </w:rPr>
+              <w:t xml:space="preserve">"SECTION_rarity"</w:t>
+            </w:r>
+            <w:r>
+              <w:rPr>
+                <w:rFonts w:ascii="Courier New" w:cs="Courier New" w:eastAsia="Courier New" w:hAnsi="Courier New"/>
+                <w:color w:val="E0E0E0"/>
+                <w:sz w:val="18"/>
+                <w:szCs w:val="18"/>
+              </w:rPr>
+              <w:t xml:space="preserve">]: entry ? tr(rarityAbbrevKey[entry.rarity] || </w:t>
+            </w:r>
+            <w:r>
+              <w:rPr>
+                <w:rFonts w:ascii="Courier New" w:cs="Courier New" w:eastAsia="Courier New" w:hAnsi="Courier New"/>
+                <w:color w:val="CE9178"/>
+                <w:sz w:val="18"/>
+                <w:szCs w:val="18"/>
+              </w:rPr>
+              <w:t xml:space="preserve">""</w:t>
+            </w:r>
+            <w:r>
+              <w:rPr>
+                <w:rFonts w:ascii="Courier New" w:cs="Courier New" w:eastAsia="Courier New" w:hAnsi="Courier New"/>
+                <w:color w:val="E0E0E0"/>
+                <w:sz w:val="18"/>
+                <w:szCs w:val="18"/>
+              </w:rPr>
+              <w:t xml:space="preserve">) : </w:t>
+            </w:r>
+            <w:r>
+              <w:rPr>
+                <w:rFonts w:ascii="Courier New" w:cs="Courier New" w:eastAsia="Courier New" w:hAnsi="Courier New"/>
+                <w:color w:val="CE9178"/>
+                <w:sz w:val="18"/>
+                <w:szCs w:val="18"/>
+              </w:rPr>
+              <w:t xml:space="preserve">""</w:t>
+            </w:r>
+            <w:r>
+              <w:rPr>
+                <w:rFonts w:ascii="Courier New" w:cs="Courier New" w:eastAsia="Courier New" w:hAnsi="Courier New"/>
+                <w:color w:val="E0E0E0"/>
+                <w:sz w:val="18"/>
+                <w:szCs w:val="18"/>
+              </w:rPr>
+              <w:t xml:space="preserve">,</w:t>
+            </w:r>
+            <w:r>
+              <w:br/>
+              <w:t xml:space="preserve"/>
+            </w:r>
+            <w:r>
+              <w:rPr>
+                <w:rFonts w:ascii="Courier New" w:cs="Courier New" w:eastAsia="Courier New" w:hAnsi="Courier New"/>
+                <w:color w:val="E0E0E0"/>
+                <w:sz w:val="18"/>
+                <w:szCs w:val="18"/>
+              </w:rPr>
+              <w:t xml:space="preserve">		// Add more attrs here for multi-column sections:</w:t>
+            </w:r>
+            <w:r>
+              <w:br/>
+              <w:t xml:space="preserve"/>
+            </w:r>
+            <w:r>
+              <w:rPr>
+                <w:rFonts w:ascii="Courier New" w:cs="Courier New" w:eastAsia="Courier New" w:hAnsi="Courier New"/>
+                <w:color w:val="E0E0E0"/>
+                <w:sz w:val="18"/>
+                <w:szCs w:val="18"/>
+              </w:rPr>
+              <w:t xml:space="preserve">		// [p + </w:t>
+            </w:r>
+            <w:r>
+              <w:rPr>
+                <w:rFonts w:ascii="Courier New" w:cs="Courier New" w:eastAsia="Courier New" w:hAnsi="Courier New"/>
+                <w:color w:val="CE9178"/>
+                <w:sz w:val="18"/>
+                <w:szCs w:val="18"/>
+              </w:rPr>
+              <w:t xml:space="preserve">"SECTION_bonus"</w:t>
+            </w:r>
+            <w:r>
+              <w:rPr>
+                <w:rFonts w:ascii="Courier New" w:cs="Courier New" w:eastAsia="Courier New" w:hAnsi="Courier New"/>
+                <w:color w:val="E0E0E0"/>
+                <w:sz w:val="18"/>
+                <w:szCs w:val="18"/>
+              </w:rPr>
+              <w:t xml:space="preserve">]: entry ? String(entry.skill_bonus_pct || </w:t>
+            </w:r>
+            <w:r>
+              <w:rPr>
+                <w:rFonts w:ascii="Courier New" w:cs="Courier New" w:eastAsia="Courier New" w:hAnsi="Courier New"/>
+                <w:color w:val="CE9178"/>
+                <w:sz w:val="18"/>
+                <w:szCs w:val="18"/>
+              </w:rPr>
+              <w:t xml:space="preserve">""</w:t>
+            </w:r>
+            <w:r>
+              <w:rPr>
+                <w:rFonts w:ascii="Courier New" w:cs="Courier New" w:eastAsia="Courier New" w:hAnsi="Courier New"/>
+                <w:color w:val="E0E0E0"/>
+                <w:sz w:val="18"/>
+                <w:szCs w:val="18"/>
+              </w:rPr>
+              <w:t xml:space="preserve">) : </w:t>
+            </w:r>
+            <w:r>
+              <w:rPr>
+                <w:rFonts w:ascii="Courier New" w:cs="Courier New" w:eastAsia="Courier New" w:hAnsi="Courier New"/>
+                <w:color w:val="CE9178"/>
+                <w:sz w:val="18"/>
+                <w:szCs w:val="18"/>
+              </w:rPr>
+              <w:t xml:space="preserve">""</w:t>
+            </w:r>
+            <w:r>
+              <w:rPr>
+                <w:rFonts w:ascii="Courier New" w:cs="Courier New" w:eastAsia="Courier New" w:hAnsi="Courier New"/>
+                <w:color w:val="E0E0E0"/>
+                <w:sz w:val="18"/>
+                <w:szCs w:val="18"/>
+              </w:rPr>
+              <w:t xml:space="preserve">,</w:t>
+            </w:r>
+            <w:r>
+              <w:br/>
+              <w:t xml:space="preserve"/>
+            </w:r>
+            <w:r>
+              <w:rPr>
+                <w:rFonts w:ascii="Courier New" w:cs="Courier New" w:eastAsia="Courier New" w:hAnsi="Courier New"/>
+                <w:color w:val="E0E0E0"/>
+                <w:sz w:val="18"/>
+                <w:szCs w:val="18"/>
+              </w:rPr>
+              <w:t xml:space="preserve">	});</w:t>
+            </w:r>
+            <w:r>
+              <w:br/>
+              <w:t xml:space="preserve"/>
+            </w:r>
+            <w:r>
+              <w:rPr>
+                <w:rFonts w:ascii="Courier New" w:cs="Courier New" w:eastAsia="Courier New" w:hAnsi="Courier New"/>
+                <w:color w:val="E0E0E0"/>
+                <w:sz w:val="18"/>
+                <w:szCs w:val="18"/>
+              </w:rPr>
+              <w:t xml:space="preserve">}</w:t>
+            </w:r>
+            <w:r>
+              <w:br/>
+              <w:t xml:space="preserve"/>
+            </w:r>
+            <w:r>
+              <w:br/>
+              <w:t xml:space="preserve"/>
+            </w:r>
+            <w:r>
+              <w:rPr>
+                <w:rFonts w:ascii="Courier New" w:cs="Courier New" w:eastAsia="Courier New" w:hAnsi="Courier New"/>
+                <w:color w:val="E0E0E0"/>
+                <w:sz w:val="18"/>
+                <w:szCs w:val="18"/>
+              </w:rPr>
+              <w:t xml:space="preserve">/* ── Core: fill attrs for one SECTION row (static SECTION1/2) ──────── */</w:t>
+            </w:r>
+            <w:r>
+              <w:br/>
+              <w:t xml:space="preserve"/>
+            </w:r>
+            <w:r>
+              <w:rPr>
+                <w:rFonts w:ascii="Courier New" w:cs="Courier New" w:eastAsia="Courier New" w:hAnsi="Courier New"/>
+                <w:color w:val="569CD6"/>
+                <w:sz w:val="18"/>
+                <w:szCs w:val="18"/>
+              </w:rPr>
+              <w:t xml:space="preserve">function</w:t>
+            </w:r>
+            <w:r>
+              <w:rPr>
+                <w:rFonts w:ascii="Courier New" w:cs="Courier New" w:eastAsia="Courier New" w:hAnsi="Courier New"/>
+                <w:color w:val="E0E0E0"/>
+                <w:sz w:val="18"/>
+                <w:szCs w:val="18"/>
+              </w:rPr>
+              <w:t xml:space="preserve"> applySECTIONPresetStatic(index, presetKey) {</w:t>
+            </w:r>
+            <w:r>
+              <w:br/>
+              <w:t xml:space="preserve"/>
+            </w:r>
+            <w:r>
+              <w:rPr>
+                <w:rFonts w:ascii="Courier New" w:cs="Courier New" w:eastAsia="Courier New" w:hAnsi="Courier New"/>
+                <w:color w:val="E0E0E0"/>
+                <w:sz w:val="18"/>
+                <w:szCs w:val="18"/>
+              </w:rPr>
+              <w:t xml:space="preserve">	</w:t>
+            </w:r>
+            <w:r>
+              <w:rPr>
+                <w:rFonts w:ascii="Courier New" w:cs="Courier New" w:eastAsia="Courier New" w:hAnsi="Courier New"/>
+                <w:color w:val="569CD6"/>
+                <w:sz w:val="18"/>
+                <w:szCs w:val="18"/>
+              </w:rPr>
+              <w:t xml:space="preserve">const</w:t>
+            </w:r>
+            <w:r>
+              <w:rPr>
+                <w:rFonts w:ascii="Courier New" w:cs="Courier New" w:eastAsia="Courier New" w:hAnsi="Courier New"/>
+                <w:color w:val="E0E0E0"/>
+                <w:sz w:val="18"/>
+                <w:szCs w:val="18"/>
+              </w:rPr>
+              <w:t xml:space="preserve"> entry = presetKey ? SECTIONDataMap[presetKey] : </w:t>
+            </w:r>
+            <w:r>
+              <w:rPr>
+                <w:rFonts w:ascii="Courier New" w:cs="Courier New" w:eastAsia="Courier New" w:hAnsi="Courier New"/>
+                <w:color w:val="569CD6"/>
+                <w:sz w:val="18"/>
+                <w:szCs w:val="18"/>
+              </w:rPr>
+              <w:t xml:space="preserve">null</w:t>
             </w:r>
             <w:r>
               <w:rPr>
@@ -6911,25 +7457,7 @@
                 <w:sz w:val="18"/>
                 <w:szCs w:val="18"/>
               </w:rPr>
-              <w:t xml:space="preserve">		[p + </w:t>
-            </w:r>
-            <w:r>
-              <w:rPr>
-                <w:rFonts w:ascii="Courier New" w:cs="Courier New" w:eastAsia="Courier New" w:hAnsi="Courier New"/>
-                <w:color w:val="CE9178"/>
-                <w:sz w:val="18"/>
-                <w:szCs w:val="18"/>
-              </w:rPr>
-              <w:t xml:space="preserve">"SECTION_effect"</w:t>
-            </w:r>
-            <w:r>
-              <w:rPr>
-                <w:rFonts w:ascii="Courier New" w:cs="Courier New" w:eastAsia="Courier New" w:hAnsi="Courier New"/>
-                <w:color w:val="E0E0E0"/>
-                <w:sz w:val="18"/>
-                <w:szCs w:val="18"/>
-              </w:rPr>
-              <w:t xml:space="preserve">]: entry.effect_key ? tr(entry.effect_key) : </w:t>
+              <w:t xml:space="preserve">		[`SECTION${index}_effect`]: entry &amp;&amp; entry.effect_key ? tr(entry.effect_key) : </w:t>
             </w:r>
             <w:r>
               <w:rPr>
@@ -6960,38 +7488,7 @@
                 <w:sz w:val="18"/>
                 <w:szCs w:val="18"/>
               </w:rPr>
-              <w:t xml:space="preserve">		// Add more attrs here for multi-column sections:</w:t>
-            </w:r>
-            <w:r>
-              <w:br/>
-              <w:t xml:space="preserve"/>
-            </w:r>
-            <w:r>
-              <w:rPr>
-                <w:rFonts w:ascii="Courier New" w:cs="Courier New" w:eastAsia="Courier New" w:hAnsi="Courier New"/>
-                <w:color w:val="E0E0E0"/>
-                <w:sz w:val="18"/>
-                <w:szCs w:val="18"/>
-              </w:rPr>
-              <w:t xml:space="preserve">		// [p + </w:t>
-            </w:r>
-            <w:r>
-              <w:rPr>
-                <w:rFonts w:ascii="Courier New" w:cs="Courier New" w:eastAsia="Courier New" w:hAnsi="Courier New"/>
-                <w:color w:val="CE9178"/>
-                <w:sz w:val="18"/>
-                <w:szCs w:val="18"/>
-              </w:rPr>
-              <w:t xml:space="preserve">"SECTION_bonus"</w:t>
-            </w:r>
-            <w:r>
-              <w:rPr>
-                <w:rFonts w:ascii="Courier New" w:cs="Courier New" w:eastAsia="Courier New" w:hAnsi="Courier New"/>
-                <w:color w:val="E0E0E0"/>
-                <w:sz w:val="18"/>
-                <w:szCs w:val="18"/>
-              </w:rPr>
-              <w:t xml:space="preserve">]: String(entry.skill_bonus_pct || </w:t>
+              <w:t xml:space="preserve">		[`SECTION${index}_rarity`]: entry ? tr(rarityAbbrevKey[entry.rarity] || </w:t>
             </w:r>
             <w:r>
               <w:rPr>
@@ -7009,281 +7506,7 @@
                 <w:sz w:val="18"/>
                 <w:szCs w:val="18"/>
               </w:rPr>
-              <w:t xml:space="preserve">),</w:t>
-            </w:r>
-            <w:r>
-              <w:br/>
-              <w:t xml:space="preserve"/>
-            </w:r>
-            <w:r>
-              <w:rPr>
-                <w:rFonts w:ascii="Courier New" w:cs="Courier New" w:eastAsia="Courier New" w:hAnsi="Courier New"/>
-                <w:color w:val="E0E0E0"/>
-                <w:sz w:val="18"/>
-                <w:szCs w:val="18"/>
-              </w:rPr>
-              <w:t xml:space="preserve">	});</w:t>
-            </w:r>
-            <w:r>
-              <w:br/>
-              <w:t xml:space="preserve"/>
-            </w:r>
-            <w:r>
-              <w:rPr>
-                <w:rFonts w:ascii="Courier New" w:cs="Courier New" w:eastAsia="Courier New" w:hAnsi="Courier New"/>
-                <w:color w:val="E0E0E0"/>
-                <w:sz w:val="18"/>
-                <w:szCs w:val="18"/>
-              </w:rPr>
-              <w:t xml:space="preserve">}</w:t>
-            </w:r>
-            <w:r>
-              <w:br/>
-              <w:t xml:space="preserve"/>
-            </w:r>
-            <w:r>
-              <w:br/>
-              <w:t xml:space="preserve"/>
-            </w:r>
-            <w:r>
-              <w:rPr>
-                <w:rFonts w:ascii="Courier New" w:cs="Courier New" w:eastAsia="Courier New" w:hAnsi="Courier New"/>
-                <w:color w:val="E0E0E0"/>
-                <w:sz w:val="18"/>
-                <w:szCs w:val="18"/>
-              </w:rPr>
-              <w:t xml:space="preserve">/* ── Core: fill attrs for one SECTION row (static SECTION1/2) ──────── */</w:t>
-            </w:r>
-            <w:r>
-              <w:br/>
-              <w:t xml:space="preserve"/>
-            </w:r>
-            <w:r>
-              <w:rPr>
-                <w:rFonts w:ascii="Courier New" w:cs="Courier New" w:eastAsia="Courier New" w:hAnsi="Courier New"/>
-                <w:color w:val="569CD6"/>
-                <w:sz w:val="18"/>
-                <w:szCs w:val="18"/>
-              </w:rPr>
-              <w:t xml:space="preserve">function</w:t>
-            </w:r>
-            <w:r>
-              <w:rPr>
-                <w:rFonts w:ascii="Courier New" w:cs="Courier New" w:eastAsia="Courier New" w:hAnsi="Courier New"/>
-                <w:color w:val="E0E0E0"/>
-                <w:sz w:val="18"/>
-                <w:szCs w:val="18"/>
-              </w:rPr>
-              <w:t xml:space="preserve"> applySECTIONPresetStatic(index, presetKey) {</w:t>
-            </w:r>
-            <w:r>
-              <w:br/>
-              <w:t xml:space="preserve"/>
-            </w:r>
-            <w:r>
-              <w:rPr>
-                <w:rFonts w:ascii="Courier New" w:cs="Courier New" w:eastAsia="Courier New" w:hAnsi="Courier New"/>
-                <w:color w:val="E0E0E0"/>
-                <w:sz w:val="18"/>
-                <w:szCs w:val="18"/>
-              </w:rPr>
-              <w:t xml:space="preserve">	</w:t>
-            </w:r>
-            <w:r>
-              <w:rPr>
-                <w:rFonts w:ascii="Courier New" w:cs="Courier New" w:eastAsia="Courier New" w:hAnsi="Courier New"/>
-                <w:color w:val="569CD6"/>
-                <w:sz w:val="18"/>
-                <w:szCs w:val="18"/>
-              </w:rPr>
-              <w:t xml:space="preserve">const</w:t>
-            </w:r>
-            <w:r>
-              <w:rPr>
-                <w:rFonts w:ascii="Courier New" w:cs="Courier New" w:eastAsia="Courier New" w:hAnsi="Courier New"/>
-                <w:color w:val="E0E0E0"/>
-                <w:sz w:val="18"/>
-                <w:szCs w:val="18"/>
-              </w:rPr>
-              <w:t xml:space="preserve"> entry = presetKey ? SECTIONDataMap[presetKey] : </w:t>
-            </w:r>
-            <w:r>
-              <w:rPr>
-                <w:rFonts w:ascii="Courier New" w:cs="Courier New" w:eastAsia="Courier New" w:hAnsi="Courier New"/>
-                <w:color w:val="569CD6"/>
-                <w:sz w:val="18"/>
-                <w:szCs w:val="18"/>
-              </w:rPr>
-              <w:t xml:space="preserve">null</w:t>
-            </w:r>
-            <w:r>
-              <w:rPr>
-                <w:rFonts w:ascii="Courier New" w:cs="Courier New" w:eastAsia="Courier New" w:hAnsi="Courier New"/>
-                <w:color w:val="E0E0E0"/>
-                <w:sz w:val="18"/>
-                <w:szCs w:val="18"/>
-              </w:rPr>
-              <w:t xml:space="preserve">;</w:t>
-            </w:r>
-            <w:r>
-              <w:br/>
-              <w:t xml:space="preserve"/>
-            </w:r>
-            <w:r>
-              <w:rPr>
-                <w:rFonts w:ascii="Courier New" w:cs="Courier New" w:eastAsia="Courier New" w:hAnsi="Courier New"/>
-                <w:color w:val="E0E0E0"/>
-                <w:sz w:val="18"/>
-                <w:szCs w:val="18"/>
-              </w:rPr>
-              <w:t xml:space="preserve">	</w:t>
-            </w:r>
-            <w:r>
-              <w:rPr>
-                <w:rFonts w:ascii="Courier New" w:cs="Courier New" w:eastAsia="Courier New" w:hAnsi="Courier New"/>
-                <w:color w:val="569CD6"/>
-                <w:sz w:val="18"/>
-                <w:szCs w:val="18"/>
-              </w:rPr>
-              <w:t xml:space="preserve">if</w:t>
-            </w:r>
-            <w:r>
-              <w:rPr>
-                <w:rFonts w:ascii="Courier New" w:cs="Courier New" w:eastAsia="Courier New" w:hAnsi="Courier New"/>
-                <w:color w:val="E0E0E0"/>
-                <w:sz w:val="18"/>
-                <w:szCs w:val="18"/>
-              </w:rPr>
-              <w:t xml:space="preserve"> (!entry) </w:t>
-            </w:r>
-            <w:r>
-              <w:rPr>
-                <w:rFonts w:ascii="Courier New" w:cs="Courier New" w:eastAsia="Courier New" w:hAnsi="Courier New"/>
-                <w:color w:val="569CD6"/>
-                <w:sz w:val="18"/>
-                <w:szCs w:val="18"/>
-              </w:rPr>
-              <w:t xml:space="preserve">return</w:t>
-            </w:r>
-            <w:r>
-              <w:rPr>
-                <w:rFonts w:ascii="Courier New" w:cs="Courier New" w:eastAsia="Courier New" w:hAnsi="Courier New"/>
-                <w:color w:val="E0E0E0"/>
-                <w:sz w:val="18"/>
-                <w:szCs w:val="18"/>
-              </w:rPr>
-              <w:t xml:space="preserve">;</w:t>
-            </w:r>
-            <w:r>
-              <w:br/>
-              <w:t xml:space="preserve"/>
-            </w:r>
-            <w:r>
-              <w:rPr>
-                <w:rFonts w:ascii="Courier New" w:cs="Courier New" w:eastAsia="Courier New" w:hAnsi="Courier New"/>
-                <w:color w:val="E0E0E0"/>
-                <w:sz w:val="18"/>
-                <w:szCs w:val="18"/>
-              </w:rPr>
-              <w:t xml:space="preserve">	</w:t>
-            </w:r>
-            <w:r>
-              <w:rPr>
-                <w:rFonts w:ascii="Courier New" w:cs="Courier New" w:eastAsia="Courier New" w:hAnsi="Courier New"/>
-                <w:color w:val="569CD6"/>
-                <w:sz w:val="18"/>
-                <w:szCs w:val="18"/>
-              </w:rPr>
-              <w:t xml:space="preserve">const</w:t>
-            </w:r>
-            <w:r>
-              <w:rPr>
-                <w:rFonts w:ascii="Courier New" w:cs="Courier New" w:eastAsia="Courier New" w:hAnsi="Courier New"/>
-                <w:color w:val="E0E0E0"/>
-                <w:sz w:val="18"/>
-                <w:szCs w:val="18"/>
-              </w:rPr>
-              <w:t xml:space="preserve"> tr = (k) =&gt; (k &amp;&amp; typeof getTranslationByKey === </w:t>
-            </w:r>
-            <w:r>
-              <w:rPr>
-                <w:rFonts w:ascii="Courier New" w:cs="Courier New" w:eastAsia="Courier New" w:hAnsi="Courier New"/>
-                <w:color w:val="CE9178"/>
-                <w:sz w:val="18"/>
-                <w:szCs w:val="18"/>
-              </w:rPr>
-              <w:t xml:space="preserve">"function"</w:t>
-            </w:r>
-            <w:r>
-              <w:rPr>
-                <w:rFonts w:ascii="Courier New" w:cs="Courier New" w:eastAsia="Courier New" w:hAnsi="Courier New"/>
-                <w:color w:val="E0E0E0"/>
-                <w:sz w:val="18"/>
-                <w:szCs w:val="18"/>
-              </w:rPr>
-              <w:t xml:space="preserve">) ? (getTranslationByKey(k) || k) : (k || </w:t>
-            </w:r>
-            <w:r>
-              <w:rPr>
-                <w:rFonts w:ascii="Courier New" w:cs="Courier New" w:eastAsia="Courier New" w:hAnsi="Courier New"/>
-                <w:color w:val="CE9178"/>
-                <w:sz w:val="18"/>
-                <w:szCs w:val="18"/>
-              </w:rPr>
-              <w:t xml:space="preserve">""</w:t>
-            </w:r>
-            <w:r>
-              <w:rPr>
-                <w:rFonts w:ascii="Courier New" w:cs="Courier New" w:eastAsia="Courier New" w:hAnsi="Courier New"/>
-                <w:color w:val="E0E0E0"/>
-                <w:sz w:val="18"/>
-                <w:szCs w:val="18"/>
-              </w:rPr>
-              <w:t xml:space="preserve">);</w:t>
-            </w:r>
-            <w:r>
-              <w:br/>
-              <w:t xml:space="preserve"/>
-            </w:r>
-            <w:r>
-              <w:rPr>
-                <w:rFonts w:ascii="Courier New" w:cs="Courier New" w:eastAsia="Courier New" w:hAnsi="Courier New"/>
-                <w:color w:val="E0E0E0"/>
-                <w:sz w:val="18"/>
-                <w:szCs w:val="18"/>
-              </w:rPr>
-              <w:t xml:space="preserve">	</w:t>
-            </w:r>
-            <w:r>
-              <w:rPr>
-                <w:rFonts w:ascii="Courier New" w:cs="Courier New" w:eastAsia="Courier New" w:hAnsi="Courier New"/>
-                <w:color w:val="569CD6"/>
-                <w:sz w:val="18"/>
-                <w:szCs w:val="18"/>
-              </w:rPr>
-              <w:t xml:space="preserve">setAttrs</w:t>
-            </w:r>
-            <w:r>
-              <w:rPr>
-                <w:rFonts w:ascii="Courier New" w:cs="Courier New" w:eastAsia="Courier New" w:hAnsi="Courier New"/>
-                <w:color w:val="E0E0E0"/>
-                <w:sz w:val="18"/>
-                <w:szCs w:val="18"/>
-              </w:rPr>
-              <w:t xml:space="preserve">({</w:t>
-            </w:r>
-            <w:r>
-              <w:br/>
-              <w:t xml:space="preserve"/>
-            </w:r>
-            <w:r>
-              <w:rPr>
-                <w:rFonts w:ascii="Courier New" w:cs="Courier New" w:eastAsia="Courier New" w:hAnsi="Courier New"/>
-                <w:color w:val="E0E0E0"/>
-                <w:sz w:val="18"/>
-                <w:szCs w:val="18"/>
-              </w:rPr>
-              <w:t xml:space="preserve">		[`SECTION${index}_effect`]: entry.effect_key ? tr(entry.effect_key) : </w:t>
+              <w:t xml:space="preserve">) : </w:t>
             </w:r>
             <w:r>
               <w:rPr>
@@ -7371,7 +7594,7 @@
           <w:sz w:val="22"/>
           <w:szCs w:val="22"/>
         </w:rPr>
-        <w:t xml:space="preserve">Place immediately after the clothing change watchers (change:clothing2_preset), before the repeating_ct watcher.</w:t>
+        <w:t xml:space="preserve">Place after the previous section's change watchers, before the repeating_ct watcher.</w:t>
       </w:r>
     </w:p>
     <w:p>
@@ -8272,7 +8495,7 @@
           <w:sz w:val="22"/>
           <w:szCs w:val="22"/>
         </w:rPr>
-        <w:t xml:space="preserve">Place immediately after initClothingPresets, before the Watchers Section - End comment.</w:t>
+        <w:t xml:space="preserve">Place after the previous section's init function, before the Watchers Section - End comment.</w:t>
       </w:r>
     </w:p>
     <w:p>
@@ -8380,19 +8603,6 @@
                 <w:sz w:val="18"/>
                 <w:szCs w:val="18"/>
               </w:rPr>
-              <w:t xml:space="preserve">	/* Static rows */</w:t>
-            </w:r>
-            <w:r>
-              <w:br/>
-              <w:t xml:space="preserve"/>
-            </w:r>
-            <w:r>
-              <w:rPr>
-                <w:rFonts w:ascii="Courier New" w:cs="Courier New" w:eastAsia="Courier New" w:hAnsi="Courier New"/>
-                <w:color w:val="E0E0E0"/>
-                <w:sz w:val="18"/>
-                <w:szCs w:val="18"/>
-              </w:rPr>
               <w:t xml:space="preserve">	</w:t>
             </w:r>
             <w:r>
@@ -8595,19 +8805,6 @@
                 <w:szCs w:val="18"/>
               </w:rPr>
               <w:t xml:space="preserve">	});</w:t>
-            </w:r>
-            <w:r>
-              <w:br/>
-              <w:t xml:space="preserve"/>
-            </w:r>
-            <w:r>
-              <w:rPr>
-                <w:rFonts w:ascii="Courier New" w:cs="Courier New" w:eastAsia="Courier New" w:hAnsi="Courier New"/>
-                <w:color w:val="E0E0E0"/>
-                <w:sz w:val="18"/>
-                <w:szCs w:val="18"/>
-              </w:rPr>
-              <w:t xml:space="preserve">	/* Repeating rows */</w:t>
             </w:r>
             <w:r>
               <w:br/>
@@ -8992,30 +9189,6 @@
         <w:t xml:space="preserve">5d — Wire into afterAllSets</w:t>
       </w:r>
     </w:p>
-    <w:p>
-      <w:pPr>
-        <w:spacing w:after="100" w:before="0"/>
-      </w:pPr>
-      <w:r>
-        <w:rPr>
-          <w:rFonts w:ascii="Arial" w:cs="Arial" w:eastAsia="Arial" w:hAnsi="Arial"/>
-          <w:b w:val="false"/>
-          <w:bCs w:val="false"/>
-          <w:color w:val="C8C8C8"/>
-          <w:sz w:val="22"/>
-          <w:szCs w:val="22"/>
-        </w:rPr>
-        <w:t xml:space="preserve">Find the afterAllSets function (search for initClothingPresets()) and add the new init call immediately after it:</w:t>
-      </w:r>
-    </w:p>
-    <w:p>
-      <w:pPr>
-        <w:spacing w:after="80" w:before="0"/>
-      </w:pPr>
-      <w:r>
-        <w:t xml:space="preserve"/>
-      </w:r>
-    </w:p>
     <w:tbl>
       <w:tblPr>
         <w:tblW w:type="dxa" w:w="9360"/>
@@ -9074,6 +9247,19 @@
                 <w:szCs w:val="18"/>
               </w:rPr>
               <w:t xml:space="preserve">initClothingPresets();</w:t>
+            </w:r>
+            <w:r>
+              <w:br/>
+              <w:t xml:space="preserve"/>
+            </w:r>
+            <w:r>
+              <w:rPr>
+                <w:rFonts w:ascii="Courier New" w:cs="Courier New" w:eastAsia="Courier New" w:hAnsi="Courier New"/>
+                <w:color w:val="E0E0E0"/>
+                <w:sz w:val="18"/>
+                <w:szCs w:val="18"/>
+              </w:rPr>
+              <w:t xml:space="preserve">initDisguisePresets();</w:t>
             </w:r>
             <w:r>
               <w:br/>
@@ -9255,7 +9441,7 @@
                 <w:sz w:val="20"/>
                 <w:szCs w:val="20"/>
               </w:rPr>
-              <w:t xml:space="preserve">class= on named spans ignored</w:t>
+              <w:t xml:space="preserve">Fields don't clear on deselect</w:t>
             </w:r>
           </w:p>
         </w:tc>
@@ -9287,7 +9473,7 @@
                 <w:sz w:val="20"/>
                 <w:szCs w:val="20"/>
               </w:rPr>
-              <w:t xml:space="preserve">Always use a wrapper div for styling. &lt;div class="x"&gt;&lt;span name="attr_y"&gt;&lt;/span&gt;&lt;/div&gt;</w:t>
+              <w:t xml:space="preserve">Never use if (!entry) return. Always call setAttrs. Pass a single space " " (not empty string "") when clearing — Roll20 ignores setAttrs calls that set a value to "", so the span keeps showing the old value.</w:t>
             </w:r>
           </w:p>
         </w:tc>
@@ -9321,7 +9507,7 @@
                 <w:sz w:val="20"/>
                 <w:szCs w:val="20"/>
               </w:rPr>
-              <w:t xml:space="preserve">overflow: hidden clips tooltip bubble</w:t>
+              <w:t xml:space="preserve">class= on named spans ignored</w:t>
             </w:r>
           </w:p>
         </w:tc>
@@ -9353,7 +9539,7 @@
                 <w:sz w:val="20"/>
                 <w:szCs w:val="20"/>
               </w:rPr>
-              <w:t xml:space="preserve">Never set overflow: hidden on the effect cell or the tooltip wrapper. Only the preview div gets it.</w:t>
+              <w:t xml:space="preserve">Use a wrapper div for styling. &lt;div class="x"&gt;&lt;span name="attr_y"&gt;&lt;/span&gt;&lt;/div&gt;. The rarity span is the exception — single letter, no truncation needed, plain span is fine.</w:t>
             </w:r>
           </w:p>
         </w:tc>
@@ -9387,7 +9573,7 @@
                 <w:sz w:val="20"/>
                 <w:szCs w:val="20"/>
               </w:rPr>
-              <w:t xml:space="preserve">display: block on tooltip breaks positioning</w:t>
+              <w:t xml:space="preserve">Column widths don't add up</w:t>
             </w:r>
           </w:p>
         </w:tc>
@@ -9419,7 +9605,7 @@
                 <w:sz w:val="20"/>
                 <w:szCs w:val="20"/>
               </w:rPr>
-              <w:t xml:space="preserve">Do not override sheet-skill-tooltip's display. Leave it as inline-flex — that's what gives it position: relative for the absolute bubble.</w:t>
+              <w:t xml:space="preserve">When adding or removing a column, adjust the others. Standard 4-col total is ~813px: 190 + 24 + 24 + 575.</w:t>
             </w:r>
           </w:p>
         </w:tc>
@@ -9453,7 +9639,7 @@
                 <w:sz w:val="20"/>
                 <w:szCs w:val="20"/>
               </w:rPr>
-              <w:t xml:space="preserve">Flex percentages don't work</w:t>
+              <w:t xml:space="preserve">overflow: hidden clips tooltip bubble</w:t>
             </w:r>
           </w:p>
         </w:tc>
@@ -9485,7 +9671,7 @@
                 <w:sz w:val="20"/>
                 <w:szCs w:val="20"/>
               </w:rPr>
-              <w:t xml:space="preserve">Use width: Npx for all column cells, not flex: N N N%. Roll20's global .flex-cell rules fight flex-basis values.</w:t>
+              <w:t xml:space="preserve">Never set overflow: hidden on the effect cell or tooltip wrapper. Only the preview div gets it.</w:t>
             </w:r>
           </w:p>
         </w:tc>
@@ -9519,7 +9705,7 @@
                 <w:sz w:val="20"/>
                 <w:szCs w:val="20"/>
               </w:rPr>
-              <w:t xml:space="preserve">Tooltip doesn't appear</w:t>
+              <w:t xml:space="preserve">display: block on tooltip breaks positioning</w:t>
             </w:r>
           </w:p>
         </w:tc>
@@ -9551,7 +9737,7 @@
                 <w:sz w:val="20"/>
                 <w:szCs w:val="20"/>
               </w:rPr>
-              <w:t xml:space="preserve">Check has-notes is on the sheet-skill-tooltip div. Check the parent doesn't have overflow: hidden. Check position: relative is intact on the tooltip wrapper.</w:t>
+              <w:t xml:space="preserve">Do not override sheet-skill-tooltip's display. Leave it as inline-flex.</w:t>
             </w:r>
           </w:p>
         </w:tc>
@@ -9585,7 +9771,7 @@
                 <w:sz w:val="20"/>
                 <w:szCs w:val="20"/>
               </w:rPr>
-              <w:t xml:space="preserve">Effect text doesn't fill</w:t>
+              <w:t xml:space="preserve">Flex percentages don't work</w:t>
             </w:r>
           </w:p>
         </w:tc>
@@ -9617,7 +9803,7 @@
                 <w:sz w:val="20"/>
                 <w:szCs w:val="20"/>
               </w:rPr>
-              <w:t xml:space="preserve">Verify getTranslationByKey is available and the effect_key exists in translation.json with the exact string including -u suffix.</w:t>
+              <w:t xml:space="preserve">Use width: Npx for all columns. Roll20's global .flex-cell rules fight flex-basis values.</w:t>
             </w:r>
           </w:p>
         </w:tc>
@@ -9651,7 +9837,7 @@
                 <w:sz w:val="20"/>
                 <w:szCs w:val="20"/>
               </w:rPr>
-              <w:t xml:space="preserve">Repeating row ID extraction</w:t>
+              <w:t xml:space="preserve">Tooltip doesn't appear</w:t>
             </w:r>
           </w:p>
         </w:tc>
@@ -9683,7 +9869,7 @@
                 <w:sz w:val="20"/>
                 <w:szCs w:val="20"/>
               </w:rPr>
-              <w:t xml:space="preserve">Always match with /^repeating_SECTIONgear_([^_]+)_/ — the capture group must exclude trailing underscore.</w:t>
+              <w:t xml:space="preserve">Check has-notes is on sheet-skill-tooltip. Check no overflow: hidden on parents. Check position: relative is intact.</w:t>
             </w:r>
           </w:p>
         </w:tc>
@@ -9717,7 +9903,7 @@
                 <w:sz w:val="20"/>
                 <w:szCs w:val="20"/>
               </w:rPr>
-              <w:t xml:space="preserve">Section doesn't collapse</w:t>
+              <w:t xml:space="preserve">Repeating row ID extraction</w:t>
             </w:r>
           </w:p>
         </w:tc>
@@ -9749,7 +9935,73 @@
                 <w:sz w:val="20"/>
                 <w:szCs w:val="20"/>
               </w:rPr>
-              <w:t xml:space="preserve">The sheet-gear-collapsible CSS is already in the stylesheet. The for= on the label must exactly match the id= on the checkbox, and the name= must be attr_gear_SECTION_collapse.</w:t>
+              <w:t xml:space="preserve">Match with /^repeating_SECTIONgear_([^_]+)_/ — capture group must exclude trailing underscore.</w:t>
+            </w:r>
+          </w:p>
+        </w:tc>
+      </w:tr>
+      <w:tr>
+        <w:tc>
+          <w:tcPr>
+            <w:tcW w:type="dxa" w:w="3200"/>
+            <w:tcBorders>
+              <w:top w:val="single" w:color="00BFFF" w:sz="1"/>
+              <w:left w:val="single" w:color="00BFFF" w:sz="1"/>
+              <w:bottom w:val="single" w:color="00BFFF" w:sz="1"/>
+              <w:right w:val="single" w:color="00BFFF" w:sz="1"/>
+            </w:tcBorders>
+            <w:shd w:fill="0D0D1A" w:val="clear"/>
+            <w:tcMar>
+              <w:top w:type="dxa" w:w="60"/>
+              <w:left w:type="dxa" w:w="120"/>
+              <w:bottom w:type="dxa" w:w="60"/>
+              <w:right w:type="dxa" w:w="120"/>
+            </w:tcMar>
+          </w:tcPr>
+          <w:p>
+            <w:pPr>
+              <w:spacing w:after="0" w:before="0"/>
+            </w:pPr>
+            <w:r>
+              <w:rPr>
+                <w:rFonts w:ascii="Arial" w:cs="Arial" w:eastAsia="Arial" w:hAnsi="Arial"/>
+                <w:color w:val="C8C8C8"/>
+                <w:sz w:val="20"/>
+                <w:szCs w:val="20"/>
+              </w:rPr>
+              <w:t xml:space="preserve">Section doesn't collapse</w:t>
+            </w:r>
+          </w:p>
+        </w:tc>
+        <w:tc>
+          <w:tcPr>
+            <w:tcW w:type="dxa" w:w="6160"/>
+            <w:tcBorders>
+              <w:top w:val="single" w:color="00BFFF" w:sz="1"/>
+              <w:left w:val="single" w:color="00BFFF" w:sz="1"/>
+              <w:bottom w:val="single" w:color="00BFFF" w:sz="1"/>
+              <w:right w:val="single" w:color="00BFFF" w:sz="1"/>
+            </w:tcBorders>
+            <w:shd w:fill="0D0D1A" w:val="clear"/>
+            <w:tcMar>
+              <w:top w:type="dxa" w:w="60"/>
+              <w:left w:type="dxa" w:w="120"/>
+              <w:bottom w:type="dxa" w:w="60"/>
+              <w:right w:type="dxa" w:w="120"/>
+            </w:tcMar>
+          </w:tcPr>
+          <w:p>
+            <w:pPr>
+              <w:spacing w:after="0" w:before="0"/>
+            </w:pPr>
+            <w:r>
+              <w:rPr>
+                <w:rFonts w:ascii="Arial" w:cs="Arial" w:eastAsia="Arial" w:hAnsi="Arial"/>
+                <w:color w:val="C8C8C8"/>
+                <w:sz w:val="20"/>
+                <w:szCs w:val="20"/>
+              </w:rPr>
+              <w:t xml:space="preserve">for= on label must exactly match id= on checkbox. name= must be attr_gear_SECTION_collapse.</w:t>
             </w:r>
           </w:p>
         </w:tc>
@@ -9778,22 +10030,6 @@
           <w:szCs w:val="36"/>
         </w:rPr>
         <w:t xml:space="preserve">Implementation Checklist</w:t>
-      </w:r>
-    </w:p>
-    <w:p>
-      <w:pPr>
-        <w:spacing w:after="100" w:before="0"/>
-      </w:pPr>
-      <w:r>
-        <w:rPr>
-          <w:rFonts w:ascii="Arial" w:cs="Arial" w:eastAsia="Arial" w:hAnsi="Arial"/>
-          <w:b w:val="false"/>
-          <w:bCs w:val="false"/>
-          <w:color w:val="C8C8C8"/>
-          <w:sz w:val="22"/>
-          <w:szCs w:val="22"/>
-        </w:rPr>
-        <w:t xml:space="preserve">Run through this for every new section before testing in Roll20:</w:t>
       </w:r>
     </w:p>
     <w:p>
@@ -9858,7 +10094,26 @@
           <w:sz w:val="22"/>
           <w:szCs w:val="22"/>
         </w:rPr>
-        <w:t xml:space="preserve">translation.json — section label key, preset key, placeholder key, equipped key, effect header key added</w:t>
+        <w:t xml:space="preserve">translation.json — section label, preset, placeholder, equipped, effect header keys added</w:t>
+      </w:r>
+    </w:p>
+    <w:p>
+      <w:pPr>
+        <w:pStyle w:val="ListParagraph"/>
+        <w:numPr>
+          <w:ilvl w:val="0"/>
+          <w:numId w:val="2"/>
+        </w:numPr>
+        <w:spacing w:after="60" w:before="0"/>
+      </w:pPr>
+      <w:r>
+        <w:rPr>
+          <w:rFonts w:ascii="Arial" w:cs="Arial" w:eastAsia="Arial" w:hAnsi="Arial"/>
+          <w:color w:val="C8C8C8"/>
+          <w:sz w:val="22"/>
+          <w:szCs w:val="22"/>
+        </w:rPr>
+        <w:t xml:space="preserve">translation.json — do NOT add rarity-u or rarity_abbrev_*-u (already in codebase)</w:t>
       </w:r>
     </w:p>
     <w:p>
@@ -9878,6 +10133,25 @@
           <w:szCs w:val="22"/>
         </w:rPr>
         <w:t xml:space="preserve">HTML data map — all entries have name_key, effect_key, cost, rarity, source</w:t>
+      </w:r>
+    </w:p>
+    <w:p>
+      <w:pPr>
+        <w:pStyle w:val="ListParagraph"/>
+        <w:numPr>
+          <w:ilvl w:val="0"/>
+          <w:numId w:val="2"/>
+        </w:numPr>
+        <w:spacing w:after="60" w:before="0"/>
+      </w:pPr>
+      <w:r>
+        <w:rPr>
+          <w:rFonts w:ascii="Arial" w:cs="Arial" w:eastAsia="Arial" w:hAnsi="Arial"/>
+          <w:color w:val="C8C8C8"/>
+          <w:sz w:val="22"/>
+          <w:szCs w:val="22"/>
+        </w:rPr>
+        <w:t xml:space="preserve">HTML data map — rarity value is exactly "common", "permit", "restricted", or "illegal"</w:t>
       </w:r>
     </w:p>
     <w:p>
@@ -9972,6 +10246,25 @@
           <w:sz w:val="22"/>
           <w:szCs w:val="22"/>
         </w:rPr>
+        <w:t xml:space="preserve">HTML section — rarity cell between name and equipped in every row and header</w:t>
+      </w:r>
+    </w:p>
+    <w:p>
+      <w:pPr>
+        <w:pStyle w:val="ListParagraph"/>
+        <w:numPr>
+          <w:ilvl w:val="0"/>
+          <w:numId w:val="2"/>
+        </w:numPr>
+        <w:spacing w:after="60" w:before="0"/>
+      </w:pPr>
+      <w:r>
+        <w:rPr>
+          <w:rFonts w:ascii="Arial" w:cs="Arial" w:eastAsia="Arial" w:hAnsi="Arial"/>
+          <w:color w:val="C8C8C8"/>
+          <w:sz w:val="22"/>
+          <w:szCs w:val="22"/>
+        </w:rPr>
         <w:t xml:space="preserve">HTML effect cells — wrapper div carries the class, not the named span</w:t>
       </w:r>
     </w:p>
@@ -10010,7 +10303,45 @@
           <w:sz w:val="22"/>
           <w:szCs w:val="22"/>
         </w:rPr>
+        <w:t xml:space="preserve">HTML rarity cells — plain named span, no wrapper div needed</w:t>
+      </w:r>
+    </w:p>
+    <w:p>
+      <w:pPr>
+        <w:pStyle w:val="ListParagraph"/>
+        <w:numPr>
+          <w:ilvl w:val="0"/>
+          <w:numId w:val="2"/>
+        </w:numPr>
+        <w:spacing w:after="60" w:before="0"/>
+      </w:pPr>
+      <w:r>
+        <w:rPr>
+          <w:rFonts w:ascii="Arial" w:cs="Arial" w:eastAsia="Arial" w:hAnsi="Arial"/>
+          <w:color w:val="C8C8C8"/>
+          <w:sz w:val="22"/>
+          <w:szCs w:val="22"/>
+        </w:rPr>
         <w:t xml:space="preserve">CSS — column widths in pixels, not flex percentages</w:t>
+      </w:r>
+    </w:p>
+    <w:p>
+      <w:pPr>
+        <w:pStyle w:val="ListParagraph"/>
+        <w:numPr>
+          <w:ilvl w:val="0"/>
+          <w:numId w:val="2"/>
+        </w:numPr>
+        <w:spacing w:after="60" w:before="0"/>
+      </w:pPr>
+      <w:r>
+        <w:rPr>
+          <w:rFonts w:ascii="Arial" w:cs="Arial" w:eastAsia="Arial" w:hAnsi="Arial"/>
+          <w:color w:val="C8C8C8"/>
+          <w:sz w:val="22"/>
+          <w:szCs w:val="22"/>
+        </w:rPr>
+        <w:t xml:space="preserve">CSS — total column width ~813px (190 + 24 + 24 + 575)</w:t>
       </w:r>
     </w:p>
     <w:p>
@@ -10067,7 +10398,45 @@
           <w:sz w:val="22"/>
           <w:szCs w:val="22"/>
         </w:rPr>
+        <w:t xml:space="preserve">JS — NO if (!entry) return — always call setAttrs, using " " (space) not "" to clear</w:t>
+      </w:r>
+    </w:p>
+    <w:p>
+      <w:pPr>
+        <w:pStyle w:val="ListParagraph"/>
+        <w:numPr>
+          <w:ilvl w:val="0"/>
+          <w:numId w:val="2"/>
+        </w:numPr>
+        <w:spacing w:after="60" w:before="0"/>
+      </w:pPr>
+      <w:r>
+        <w:rPr>
+          <w:rFonts w:ascii="Arial" w:cs="Arial" w:eastAsia="Arial" w:hAnsi="Arial"/>
+          <w:color w:val="C8C8C8"/>
+          <w:sz w:val="22"/>
+          <w:szCs w:val="22"/>
+        </w:rPr>
         <w:t xml:space="preserve">JS — applySECTIONPreset and applySECTIONPresetStatic defined</w:t>
+      </w:r>
+    </w:p>
+    <w:p>
+      <w:pPr>
+        <w:pStyle w:val="ListParagraph"/>
+        <w:numPr>
+          <w:ilvl w:val="0"/>
+          <w:numId w:val="2"/>
+        </w:numPr>
+        <w:spacing w:after="60" w:before="0"/>
+      </w:pPr>
+      <w:r>
+        <w:rPr>
+          <w:rFonts w:ascii="Arial" w:cs="Arial" w:eastAsia="Arial" w:hAnsi="Arial"/>
+          <w:color w:val="C8C8C8"/>
+          <w:sz w:val="22"/>
+          <w:szCs w:val="22"/>
+        </w:rPr>
+        <w:t xml:space="preserve">JS — rarity written via rarityAbbrevKey[entry.rarity] in both apply functions</w:t>
       </w:r>
     </w:p>
     <w:p>
@@ -10154,22 +10523,6 @@
     </w:p>
     <w:p>
       <w:pPr>
-        <w:spacing w:after="100" w:before="0"/>
-      </w:pPr>
-      <w:r>
-        <w:rPr>
-          <w:rFonts w:ascii="Arial" w:cs="Arial" w:eastAsia="Arial" w:hAnsi="Arial"/>
-          <w:b w:val="false"/>
-          <w:bCs w:val="false"/>
-          <w:color w:val="C8C8C8"/>
-          <w:sz w:val="22"/>
-          <w:szCs w:val="22"/>
-        </w:rPr>
-        <w:t xml:space="preserve">These data maps are already in the codebase and ready to be wired up as Gear tab sections:</w:t>
-      </w:r>
-    </w:p>
-    <w:p>
-      <w:pPr>
         <w:spacing w:after="80" w:before="0"/>
       </w:pPr>
       <w:r>
@@ -10190,8 +10543,8 @@
       </w:tblPr>
       <w:tblGrid>
         <w:gridCol w:w="2800"/>
-        <w:gridCol w:w="2400"/>
-        <w:gridCol w:w="4160"/>
+        <w:gridCol w:w="2000"/>
+        <w:gridCol w:w="4560"/>
       </w:tblGrid>
       <w:tr>
         <w:tc>
@@ -10231,7 +10584,7 @@
         </w:tc>
         <w:tc>
           <w:tcPr>
-            <w:tcW w:type="dxa" w:w="2400"/>
+            <w:tcW w:type="dxa" w:w="2000"/>
             <w:tcBorders>
               <w:top w:val="single" w:color="00BFFF" w:sz="1"/>
               <w:left w:val="single" w:color="00BFFF" w:sz="1"/>
@@ -10260,13 +10613,13 @@
                 <w:sz w:val="20"/>
                 <w:szCs w:val="20"/>
               </w:rPr>
-              <w:t xml:space="preserve">Section key prefix</w:t>
-            </w:r>
-          </w:p>
-        </w:tc>
-        <w:tc>
-          <w:tcPr>
-            <w:tcW w:type="dxa" w:w="4160"/>
+              <w:t xml:space="preserve">Key prefix</w:t>
+            </w:r>
+          </w:p>
+        </w:tc>
+        <w:tc>
+          <w:tcPr>
+            <w:tcW w:type="dxa" w:w="4560"/>
             <w:tcBorders>
               <w:top w:val="single" w:color="00BFFF" w:sz="1"/>
               <w:left w:val="single" w:color="00BFFF" w:sz="1"/>
@@ -10295,7 +10648,7 @@
                 <w:sz w:val="20"/>
                 <w:szCs w:val="20"/>
               </w:rPr>
-              <w:t xml:space="preserve">Fields</w:t>
+              <w:t xml:space="preserve">Extra fields beyond name/cost/rarity/effect</w:t>
             </w:r>
           </w:p>
         </w:tc>
@@ -10335,7 +10688,7 @@
         </w:tc>
         <w:tc>
           <w:tcPr>
-            <w:tcW w:type="dxa" w:w="2400"/>
+            <w:tcW w:type="dxa" w:w="2000"/>
             <w:tcBorders>
               <w:top w:val="single" w:color="00BFFF" w:sz="1"/>
               <w:left w:val="single" w:color="00BFFF" w:sz="1"/>
@@ -10367,7 +10720,7 @@
         </w:tc>
         <w:tc>
           <w:tcPr>
-            <w:tcW w:type="dxa" w:w="4160"/>
+            <w:tcW w:type="dxa" w:w="4560"/>
             <w:tcBorders>
               <w:top w:val="single" w:color="00BFFF" w:sz="1"/>
               <w:left w:val="single" w:color="00BFFF" w:sz="1"/>
@@ -10393,7 +10746,7 @@
                 <w:sz w:val="20"/>
                 <w:szCs w:val="20"/>
               </w:rPr>
-              <w:t xml:space="preserve">name_key, cost, rarity, effect_key</w:t>
+              <w:t xml:space="preserve">— (effect only)</w:t>
             </w:r>
           </w:p>
         </w:tc>
@@ -10433,7 +10786,7 @@
         </w:tc>
         <w:tc>
           <w:tcPr>
-            <w:tcW w:type="dxa" w:w="2400"/>
+            <w:tcW w:type="dxa" w:w="2000"/>
             <w:tcBorders>
               <w:top w:val="single" w:color="00BFFF" w:sz="1"/>
               <w:left w:val="single" w:color="00BFFF" w:sz="1"/>
@@ -10465,7 +10818,7 @@
         </w:tc>
         <w:tc>
           <w:tcPr>
-            <w:tcW w:type="dxa" w:w="4160"/>
+            <w:tcW w:type="dxa" w:w="4560"/>
             <w:tcBorders>
               <w:top w:val="single" w:color="00BFFF" w:sz="1"/>
               <w:left w:val="single" w:color="00BFFF" w:sz="1"/>
@@ -10491,7 +10844,7 @@
                 <w:sz w:val="20"/>
                 <w:szCs w:val="20"/>
               </w:rPr>
-              <w:t xml:space="preserve">name_key, cost, rarity, skill_bonus_pct, skill_bonus_die, skill, effect_key</w:t>
+              <w:t xml:space="preserve">skill_bonus_pct, skill_bonus_die, skill</w:t>
             </w:r>
           </w:p>
         </w:tc>
@@ -10531,7 +10884,7 @@
         </w:tc>
         <w:tc>
           <w:tcPr>
-            <w:tcW w:type="dxa" w:w="2400"/>
+            <w:tcW w:type="dxa" w:w="2000"/>
             <w:tcBorders>
               <w:top w:val="single" w:color="00BFFF" w:sz="1"/>
               <w:left w:val="single" w:color="00BFFF" w:sz="1"/>
@@ -10563,7 +10916,7 @@
         </w:tc>
         <w:tc>
           <w:tcPr>
-            <w:tcW w:type="dxa" w:w="4160"/>
+            <w:tcW w:type="dxa" w:w="4560"/>
             <w:tcBorders>
               <w:top w:val="single" w:color="00BFFF" w:sz="1"/>
               <w:left w:val="single" w:color="00BFFF" w:sz="1"/>
@@ -10589,7 +10942,7 @@
                 <w:sz w:val="20"/>
                 <w:szCs w:val="20"/>
               </w:rPr>
-              <w:t xml:space="preserve">name_key, cost, rarity, skill_bonus_pct, effect_key</w:t>
+              <w:t xml:space="preserve">skill_bonus_pct</w:t>
             </w:r>
           </w:p>
         </w:tc>
@@ -10629,7 +10982,7 @@
         </w:tc>
         <w:tc>
           <w:tcPr>
-            <w:tcW w:type="dxa" w:w="2400"/>
+            <w:tcW w:type="dxa" w:w="2000"/>
             <w:tcBorders>
               <w:top w:val="single" w:color="00BFFF" w:sz="1"/>
               <w:left w:val="single" w:color="00BFFF" w:sz="1"/>
@@ -10661,7 +11014,7 @@
         </w:tc>
         <w:tc>
           <w:tcPr>
-            <w:tcW w:type="dxa" w:w="4160"/>
+            <w:tcW w:type="dxa" w:w="4560"/>
             <w:tcBorders>
               <w:top w:val="single" w:color="00BFFF" w:sz="1"/>
               <w:left w:val="single" w:color="00BFFF" w:sz="1"/>
@@ -10687,7 +11040,399 @@
                 <w:sz w:val="20"/>
                 <w:szCs w:val="20"/>
               </w:rPr>
-              <w:t xml:space="preserve">name_key, cost, rarity, skill_bonus_pct, skill, effect_key</w:t>
+              <w:t xml:space="preserve">skill_bonus_pct, skill</w:t>
+            </w:r>
+          </w:p>
+        </w:tc>
+      </w:tr>
+      <w:tr>
+        <w:tc>
+          <w:tcPr>
+            <w:tcW w:type="dxa" w:w="2800"/>
+            <w:tcBorders>
+              <w:top w:val="single" w:color="00BFFF" w:sz="1"/>
+              <w:left w:val="single" w:color="00BFFF" w:sz="1"/>
+              <w:bottom w:val="single" w:color="00BFFF" w:sz="1"/>
+              <w:right w:val="single" w:color="00BFFF" w:sz="1"/>
+            </w:tcBorders>
+            <w:shd w:fill="0D0D1A" w:val="clear"/>
+            <w:tcMar>
+              <w:top w:type="dxa" w:w="60"/>
+              <w:left w:type="dxa" w:w="120"/>
+              <w:bottom w:type="dxa" w:w="60"/>
+              <w:right w:type="dxa" w:w="120"/>
+            </w:tcMar>
+          </w:tcPr>
+          <w:p>
+            <w:pPr>
+              <w:spacing w:after="0" w:before="0"/>
+            </w:pPr>
+            <w:r>
+              <w:rPr>
+                <w:rFonts w:ascii="Courier New" w:cs="Courier New" w:eastAsia="Courier New" w:hAnsi="Courier New"/>
+                <w:color w:val="CE9178"/>
+                <w:sz w:val="18"/>
+                <w:szCs w:val="18"/>
+              </w:rPr>
+              <w:t xml:space="preserve">medtechDataMap</w:t>
+            </w:r>
+          </w:p>
+        </w:tc>
+        <w:tc>
+          <w:tcPr>
+            <w:tcW w:type="dxa" w:w="2000"/>
+            <w:tcBorders>
+              <w:top w:val="single" w:color="00BFFF" w:sz="1"/>
+              <w:left w:val="single" w:color="00BFFF" w:sz="1"/>
+              <w:bottom w:val="single" w:color="00BFFF" w:sz="1"/>
+              <w:right w:val="single" w:color="00BFFF" w:sz="1"/>
+            </w:tcBorders>
+            <w:shd w:fill="0D0D1A" w:val="clear"/>
+            <w:tcMar>
+              <w:top w:type="dxa" w:w="60"/>
+              <w:left w:type="dxa" w:w="120"/>
+              <w:bottom w:type="dxa" w:w="60"/>
+              <w:right w:type="dxa" w:w="120"/>
+            </w:tcMar>
+          </w:tcPr>
+          <w:p>
+            <w:pPr>
+              <w:spacing w:after="0" w:before="0"/>
+            </w:pPr>
+            <w:r>
+              <w:rPr>
+                <w:rFonts w:ascii="Courier New" w:cs="Courier New" w:eastAsia="Courier New" w:hAnsi="Courier New"/>
+                <w:color w:val="CE9178"/>
+                <w:sz w:val="18"/>
+                <w:szCs w:val="18"/>
+              </w:rPr>
+              <w:t xml:space="preserve">gear_</w:t>
+            </w:r>
+          </w:p>
+        </w:tc>
+        <w:tc>
+          <w:tcPr>
+            <w:tcW w:type="dxa" w:w="4560"/>
+            <w:tcBorders>
+              <w:top w:val="single" w:color="00BFFF" w:sz="1"/>
+              <w:left w:val="single" w:color="00BFFF" w:sz="1"/>
+              <w:bottom w:val="single" w:color="00BFFF" w:sz="1"/>
+              <w:right w:val="single" w:color="00BFFF" w:sz="1"/>
+            </w:tcBorders>
+            <w:shd w:fill="0D0D1A" w:val="clear"/>
+            <w:tcMar>
+              <w:top w:type="dxa" w:w="60"/>
+              <w:left w:type="dxa" w:w="120"/>
+              <w:bottom w:type="dxa" w:w="60"/>
+              <w:right w:type="dxa" w:w="120"/>
+            </w:tcMar>
+          </w:tcPr>
+          <w:p>
+            <w:pPr>
+              <w:spacing w:after="0" w:before="0"/>
+            </w:pPr>
+            <w:r>
+              <w:rPr>
+                <w:rFonts w:ascii="Arial" w:cs="Arial" w:eastAsia="Arial" w:hAnsi="Arial"/>
+                <w:color w:val="C8C8C8"/>
+                <w:sz w:val="20"/>
+                <w:szCs w:val="20"/>
+              </w:rPr>
+              <w:t xml:space="preserve">uses, skill_bonus_pct, roll_required, ticks_saturation</w:t>
+            </w:r>
+          </w:p>
+        </w:tc>
+      </w:tr>
+      <w:tr>
+        <w:tc>
+          <w:tcPr>
+            <w:tcW w:type="dxa" w:w="2800"/>
+            <w:tcBorders>
+              <w:top w:val="single" w:color="00BFFF" w:sz="1"/>
+              <w:left w:val="single" w:color="00BFFF" w:sz="1"/>
+              <w:bottom w:val="single" w:color="00BFFF" w:sz="1"/>
+              <w:right w:val="single" w:color="00BFFF" w:sz="1"/>
+            </w:tcBorders>
+            <w:shd w:fill="0D0D1A" w:val="clear"/>
+            <w:tcMar>
+              <w:top w:type="dxa" w:w="60"/>
+              <w:left w:type="dxa" w:w="120"/>
+              <w:bottom w:type="dxa" w:w="60"/>
+              <w:right w:type="dxa" w:w="120"/>
+            </w:tcMar>
+          </w:tcPr>
+          <w:p>
+            <w:pPr>
+              <w:spacing w:after="0" w:before="0"/>
+            </w:pPr>
+            <w:r>
+              <w:rPr>
+                <w:rFonts w:ascii="Courier New" w:cs="Courier New" w:eastAsia="Courier New" w:hAnsi="Courier New"/>
+                <w:color w:val="CE9178"/>
+                <w:sz w:val="18"/>
+                <w:szCs w:val="18"/>
+              </w:rPr>
+              <w:t xml:space="preserve">survivalGearDataMap</w:t>
+            </w:r>
+          </w:p>
+        </w:tc>
+        <w:tc>
+          <w:tcPr>
+            <w:tcW w:type="dxa" w:w="2000"/>
+            <w:tcBorders>
+              <w:top w:val="single" w:color="00BFFF" w:sz="1"/>
+              <w:left w:val="single" w:color="00BFFF" w:sz="1"/>
+              <w:bottom w:val="single" w:color="00BFFF" w:sz="1"/>
+              <w:right w:val="single" w:color="00BFFF" w:sz="1"/>
+            </w:tcBorders>
+            <w:shd w:fill="0D0D1A" w:val="clear"/>
+            <w:tcMar>
+              <w:top w:type="dxa" w:w="60"/>
+              <w:left w:type="dxa" w:w="120"/>
+              <w:bottom w:type="dxa" w:w="60"/>
+              <w:right w:type="dxa" w:w="120"/>
+            </w:tcMar>
+          </w:tcPr>
+          <w:p>
+            <w:pPr>
+              <w:spacing w:after="0" w:before="0"/>
+            </w:pPr>
+            <w:r>
+              <w:rPr>
+                <w:rFonts w:ascii="Courier New" w:cs="Courier New" w:eastAsia="Courier New" w:hAnsi="Courier New"/>
+                <w:color w:val="CE9178"/>
+                <w:sz w:val="18"/>
+                <w:szCs w:val="18"/>
+              </w:rPr>
+              <w:t xml:space="preserve">gear_</w:t>
+            </w:r>
+          </w:p>
+        </w:tc>
+        <w:tc>
+          <w:tcPr>
+            <w:tcW w:type="dxa" w:w="4560"/>
+            <w:tcBorders>
+              <w:top w:val="single" w:color="00BFFF" w:sz="1"/>
+              <w:left w:val="single" w:color="00BFFF" w:sz="1"/>
+              <w:bottom w:val="single" w:color="00BFFF" w:sz="1"/>
+              <w:right w:val="single" w:color="00BFFF" w:sz="1"/>
+            </w:tcBorders>
+            <w:shd w:fill="0D0D1A" w:val="clear"/>
+            <w:tcMar>
+              <w:top w:type="dxa" w:w="60"/>
+              <w:left w:type="dxa" w:w="120"/>
+              <w:bottom w:type="dxa" w:w="60"/>
+              <w:right w:type="dxa" w:w="120"/>
+            </w:tcMar>
+          </w:tcPr>
+          <w:p>
+            <w:pPr>
+              <w:spacing w:after="0" w:before="0"/>
+            </w:pPr>
+            <w:r>
+              <w:rPr>
+                <w:rFonts w:ascii="Arial" w:cs="Arial" w:eastAsia="Arial" w:hAnsi="Arial"/>
+                <w:color w:val="C8C8C8"/>
+                <w:sz w:val="20"/>
+                <w:szCs w:val="20"/>
+              </w:rPr>
+              <w:t xml:space="preserve">uses, skill_bonus_pct, skill_bonus_die, skill</w:t>
+            </w:r>
+          </w:p>
+        </w:tc>
+      </w:tr>
+      <w:tr>
+        <w:tc>
+          <w:tcPr>
+            <w:tcW w:type="dxa" w:w="2800"/>
+            <w:tcBorders>
+              <w:top w:val="single" w:color="00BFFF" w:sz="1"/>
+              <w:left w:val="single" w:color="00BFFF" w:sz="1"/>
+              <w:bottom w:val="single" w:color="00BFFF" w:sz="1"/>
+              <w:right w:val="single" w:color="00BFFF" w:sz="1"/>
+            </w:tcBorders>
+            <w:shd w:fill="0D0D1A" w:val="clear"/>
+            <w:tcMar>
+              <w:top w:type="dxa" w:w="60"/>
+              <w:left w:type="dxa" w:w="120"/>
+              <w:bottom w:type="dxa" w:w="60"/>
+              <w:right w:type="dxa" w:w="120"/>
+            </w:tcMar>
+          </w:tcPr>
+          <w:p>
+            <w:pPr>
+              <w:spacing w:after="0" w:before="0"/>
+            </w:pPr>
+            <w:r>
+              <w:rPr>
+                <w:rFonts w:ascii="Courier New" w:cs="Courier New" w:eastAsia="Courier New" w:hAnsi="Courier New"/>
+                <w:color w:val="CE9178"/>
+                <w:sz w:val="18"/>
+                <w:szCs w:val="18"/>
+              </w:rPr>
+              <w:t xml:space="preserve">generalUtilityGearDataMap</w:t>
+            </w:r>
+          </w:p>
+        </w:tc>
+        <w:tc>
+          <w:tcPr>
+            <w:tcW w:type="dxa" w:w="2000"/>
+            <w:tcBorders>
+              <w:top w:val="single" w:color="00BFFF" w:sz="1"/>
+              <w:left w:val="single" w:color="00BFFF" w:sz="1"/>
+              <w:bottom w:val="single" w:color="00BFFF" w:sz="1"/>
+              <w:right w:val="single" w:color="00BFFF" w:sz="1"/>
+            </w:tcBorders>
+            <w:shd w:fill="0D0D1A" w:val="clear"/>
+            <w:tcMar>
+              <w:top w:type="dxa" w:w="60"/>
+              <w:left w:type="dxa" w:w="120"/>
+              <w:bottom w:type="dxa" w:w="60"/>
+              <w:right w:type="dxa" w:w="120"/>
+            </w:tcMar>
+          </w:tcPr>
+          <w:p>
+            <w:pPr>
+              <w:spacing w:after="0" w:before="0"/>
+            </w:pPr>
+            <w:r>
+              <w:rPr>
+                <w:rFonts w:ascii="Courier New" w:cs="Courier New" w:eastAsia="Courier New" w:hAnsi="Courier New"/>
+                <w:color w:val="CE9178"/>
+                <w:sz w:val="18"/>
+                <w:szCs w:val="18"/>
+              </w:rPr>
+              <w:t xml:space="preserve">gear_</w:t>
+            </w:r>
+          </w:p>
+        </w:tc>
+        <w:tc>
+          <w:tcPr>
+            <w:tcW w:type="dxa" w:w="4560"/>
+            <w:tcBorders>
+              <w:top w:val="single" w:color="00BFFF" w:sz="1"/>
+              <w:left w:val="single" w:color="00BFFF" w:sz="1"/>
+              <w:bottom w:val="single" w:color="00BFFF" w:sz="1"/>
+              <w:right w:val="single" w:color="00BFFF" w:sz="1"/>
+            </w:tcBorders>
+            <w:shd w:fill="0D0D1A" w:val="clear"/>
+            <w:tcMar>
+              <w:top w:type="dxa" w:w="60"/>
+              <w:left w:type="dxa" w:w="120"/>
+              <w:bottom w:type="dxa" w:w="60"/>
+              <w:right w:type="dxa" w:w="120"/>
+            </w:tcMar>
+          </w:tcPr>
+          <w:p>
+            <w:pPr>
+              <w:spacing w:after="0" w:before="0"/>
+            </w:pPr>
+            <w:r>
+              <w:rPr>
+                <w:rFonts w:ascii="Arial" w:cs="Arial" w:eastAsia="Arial" w:hAnsi="Arial"/>
+                <w:color w:val="C8C8C8"/>
+                <w:sz w:val="20"/>
+                <w:szCs w:val="20"/>
+              </w:rPr>
+              <w:t xml:space="preserve">skill_bonus_pct, skill</w:t>
+            </w:r>
+          </w:p>
+        </w:tc>
+      </w:tr>
+      <w:tr>
+        <w:tc>
+          <w:tcPr>
+            <w:tcW w:type="dxa" w:w="2800"/>
+            <w:tcBorders>
+              <w:top w:val="single" w:color="00BFFF" w:sz="1"/>
+              <w:left w:val="single" w:color="00BFFF" w:sz="1"/>
+              <w:bottom w:val="single" w:color="00BFFF" w:sz="1"/>
+              <w:right w:val="single" w:color="00BFFF" w:sz="1"/>
+            </w:tcBorders>
+            <w:shd w:fill="0D0D1A" w:val="clear"/>
+            <w:tcMar>
+              <w:top w:type="dxa" w:w="60"/>
+              <w:left w:type="dxa" w:w="120"/>
+              <w:bottom w:type="dxa" w:w="60"/>
+              <w:right w:type="dxa" w:w="120"/>
+            </w:tcMar>
+          </w:tcPr>
+          <w:p>
+            <w:pPr>
+              <w:spacing w:after="0" w:before="0"/>
+            </w:pPr>
+            <w:r>
+              <w:rPr>
+                <w:rFonts w:ascii="Courier New" w:cs="Courier New" w:eastAsia="Courier New" w:hAnsi="Courier New"/>
+                <w:color w:val="CE9178"/>
+                <w:sz w:val="18"/>
+                <w:szCs w:val="18"/>
+              </w:rPr>
+              <w:t xml:space="preserve">arcaneSuppliesDataMap</w:t>
+            </w:r>
+          </w:p>
+        </w:tc>
+        <w:tc>
+          <w:tcPr>
+            <w:tcW w:type="dxa" w:w="2000"/>
+            <w:tcBorders>
+              <w:top w:val="single" w:color="00BFFF" w:sz="1"/>
+              <w:left w:val="single" w:color="00BFFF" w:sz="1"/>
+              <w:bottom w:val="single" w:color="00BFFF" w:sz="1"/>
+              <w:right w:val="single" w:color="00BFFF" w:sz="1"/>
+            </w:tcBorders>
+            <w:shd w:fill="0D0D1A" w:val="clear"/>
+            <w:tcMar>
+              <w:top w:type="dxa" w:w="60"/>
+              <w:left w:type="dxa" w:w="120"/>
+              <w:bottom w:type="dxa" w:w="60"/>
+              <w:right w:type="dxa" w:w="120"/>
+            </w:tcMar>
+          </w:tcPr>
+          <w:p>
+            <w:pPr>
+              <w:spacing w:after="0" w:before="0"/>
+            </w:pPr>
+            <w:r>
+              <w:rPr>
+                <w:rFonts w:ascii="Courier New" w:cs="Courier New" w:eastAsia="Courier New" w:hAnsi="Courier New"/>
+                <w:color w:val="CE9178"/>
+                <w:sz w:val="18"/>
+                <w:szCs w:val="18"/>
+              </w:rPr>
+              <w:t xml:space="preserve">gear_</w:t>
+            </w:r>
+          </w:p>
+        </w:tc>
+        <w:tc>
+          <w:tcPr>
+            <w:tcW w:type="dxa" w:w="4560"/>
+            <w:tcBorders>
+              <w:top w:val="single" w:color="00BFFF" w:sz="1"/>
+              <w:left w:val="single" w:color="00BFFF" w:sz="1"/>
+              <w:bottom w:val="single" w:color="00BFFF" w:sz="1"/>
+              <w:right w:val="single" w:color="00BFFF" w:sz="1"/>
+            </w:tcBorders>
+            <w:shd w:fill="0D0D1A" w:val="clear"/>
+            <w:tcMar>
+              <w:top w:type="dxa" w:w="60"/>
+              <w:left w:type="dxa" w:w="120"/>
+              <w:bottom w:type="dxa" w:w="60"/>
+              <w:right w:type="dxa" w:w="120"/>
+            </w:tcMar>
+          </w:tcPr>
+          <w:p>
+            <w:pPr>
+              <w:spacing w:after="0" w:before="0"/>
+            </w:pPr>
+            <w:r>
+              <w:rPr>
+                <w:rFonts w:ascii="Arial" w:cs="Arial" w:eastAsia="Arial" w:hAnsi="Arial"/>
+                <w:color w:val="C8C8C8"/>
+                <w:sz w:val="20"/>
+                <w:szCs w:val="20"/>
+              </w:rPr>
+              <w:t xml:space="preserve">uses</w:t>
             </w:r>
           </w:p>
         </w:tc>
@@ -10714,7 +11459,7 @@
           <w:sz w:val="22"/>
           <w:szCs w:val="22"/>
         </w:rPr>
-        <w:t xml:space="preserve">Additional data maps exist for omni devices, surveillance, medical, explosives, vehicles, and weapons — check the script block for the full list.</w:t>
+        <w:t xml:space="preserve">Additional data maps exist for omni devices, surveillance, explosives, vehicles, and weapons — check the script block for the full list.</w:t>
       </w:r>
     </w:p>
     <w:sectPr>

</xml_diff>